<commit_message>
Fix broken logo image path and add favicon
</commit_message>
<xml_diff>
--- a/output/documentation/TGMCI-Radiology-Queueing-System-Documentation.docx
+++ b/output/documentation/TGMCI-Radiology-Queueing-System-Documentation.docx
@@ -4,24 +4,53 @@
   <w:body>
     <w:p>
       <w:pPr>
+        <w:spacing w:after="0" w:line="259" w:lineRule="auto"/>
+        <w:ind w:right="49"/>
         <w:jc w:val="center"/>
       </w:pPr>
       <w:r>
         <w:rPr>
+          <w:rFonts w:ascii="Calibri" w:eastAsia="Calibri" w:hAnsi="Calibri" w:cs="Calibri"/>
           <w:b/>
         </w:rPr>
-        <w:t>TAGUM GLOBAL MEDICAL CENTER INC</w:t>
-      </w:r>
-    </w:p>
-    <w:p>
-      <w:pPr>
+        <w:t xml:space="preserve">UM TAGUM COLLEGE </w:t>
+      </w:r>
+    </w:p>
+    <w:p>
+      <w:pPr>
+        <w:spacing w:after="0" w:line="259" w:lineRule="auto"/>
+        <w:ind w:right="53"/>
         <w:jc w:val="center"/>
       </w:pPr>
       <w:r>
         <w:rPr>
+          <w:rFonts w:ascii="Calibri" w:eastAsia="Calibri" w:hAnsi="Calibri" w:cs="Calibri"/>
           <w:b/>
         </w:rPr>
-        <w:t>Radiology Department</w:t>
+        <w:t xml:space="preserve"> BACHELOR OF SCIENCE IN COMPUTER SCIENCE </w:t>
+      </w:r>
+    </w:p>
+    <w:p>
+      <w:pPr>
+        <w:spacing w:after="0" w:line="259" w:lineRule="auto"/>
+        <w:ind w:right="51"/>
+        <w:jc w:val="center"/>
+      </w:pPr>
+      <w:r>
+        <w:rPr>
+          <w:rFonts w:ascii="Calibri" w:eastAsia="Calibri" w:hAnsi="Calibri" w:cs="Calibri"/>
+          <w:b/>
+        </w:rPr>
+        <w:t xml:space="preserve">Department of Computing Education </w:t>
+      </w:r>
+    </w:p>
+    <w:p>
+      <w:pPr>
+        <w:spacing w:after="0" w:line="259" w:lineRule="auto"/>
+        <w:jc w:val="center"/>
+      </w:pPr>
+      <w:r>
+        <w:t xml:space="preserve"> Visayan Village, Tagum City, Philippines </w:t>
       </w:r>
     </w:p>
     <w:p/>
@@ -34,18 +63,16 @@
           <w:noProof/>
         </w:rPr>
         <w:drawing>
-          <wp:inline distT="0" distB="0" distL="0" distR="0" wp14:anchorId="6219DC81" wp14:editId="152D22A6">
-            <wp:extent cx="2468880" cy="737771"/>
+          <wp:inline distT="0" distB="0" distL="0" distR="0" wp14:anchorId="2EF16FF2" wp14:editId="7F606B81">
+            <wp:extent cx="1762125" cy="1762125"/>
             <wp:effectExtent l="0" t="0" r="0" b="0"/>
-            <wp:docPr id="1" name="Picture 1"/>
-            <wp:cNvGraphicFramePr>
-              <a:graphicFrameLocks xmlns:a="http://schemas.openxmlformats.org/drawingml/2006/main" noChangeAspect="1"/>
-            </wp:cNvGraphicFramePr>
+            <wp:docPr id="84" name="Picture 84"/>
+            <wp:cNvGraphicFramePr/>
             <a:graphic xmlns:a="http://schemas.openxmlformats.org/drawingml/2006/main">
               <a:graphicData uri="http://schemas.openxmlformats.org/drawingml/2006/picture">
                 <pic:pic xmlns:pic="http://schemas.openxmlformats.org/drawingml/2006/picture">
                   <pic:nvPicPr>
-                    <pic:cNvPr id="0" name="logo.png"/>
+                    <pic:cNvPr id="84" name="Picture 84"/>
                     <pic:cNvPicPr/>
                   </pic:nvPicPr>
                   <pic:blipFill>
@@ -57,7 +84,7 @@
                   <pic:spPr>
                     <a:xfrm>
                       <a:off x="0" y="0"/>
-                      <a:ext cx="2468880" cy="737771"/>
+                      <a:ext cx="1762125" cy="1762125"/>
                     </a:xfrm>
                     <a:prstGeom prst="rect">
                       <a:avLst/>
@@ -71,52 +98,322 @@
       </w:r>
     </w:p>
     <w:p/>
-    <w:p/>
-    <w:p/>
-    <w:p>
-      <w:pPr>
-        <w:pStyle w:val="Title"/>
+    <w:p>
+      <w:pPr>
+        <w:spacing w:after="0" w:line="259" w:lineRule="auto"/>
+        <w:ind w:right="54"/>
         <w:jc w:val="center"/>
       </w:pPr>
       <w:r>
-        <w:t>TGMCI RADIOLOGY QUEUEING SYSTEM</w:t>
-      </w:r>
-    </w:p>
-    <w:p>
-      <w:pPr>
+        <w:rPr>
+          <w:rFonts w:ascii="Calibri" w:eastAsia="Calibri" w:hAnsi="Calibri" w:cs="Calibri"/>
+          <w:b/>
+          <w:sz w:val="30"/>
+        </w:rPr>
+        <w:t xml:space="preserve">Course Requirements </w:t>
+      </w:r>
+    </w:p>
+    <w:p>
+      <w:pPr>
+        <w:spacing w:after="0" w:line="259" w:lineRule="auto"/>
+        <w:ind w:left="83"/>
         <w:jc w:val="center"/>
       </w:pPr>
       <w:r>
-        <w:t>System Documentation</w:t>
-      </w:r>
-    </w:p>
-    <w:p>
-      <w:pPr>
+        <w:rPr>
+          <w:rFonts w:ascii="Calibri" w:eastAsia="Calibri" w:hAnsi="Calibri" w:cs="Calibri"/>
+          <w:b/>
+          <w:sz w:val="30"/>
+        </w:rPr>
+        <w:t xml:space="preserve">  </w:t>
+      </w:r>
+    </w:p>
+    <w:p>
+      <w:pPr>
+        <w:spacing w:after="0" w:line="259" w:lineRule="auto"/>
         <w:jc w:val="center"/>
       </w:pPr>
       <w:r>
-        <w:t>Requirements  |  Design  |  Testing  |  User Manual</w:t>
-      </w:r>
-    </w:p>
-    <w:p>
-      <w:pPr>
+        <w:rPr>
+          <w:rFonts w:ascii="Calibri" w:eastAsia="Calibri" w:hAnsi="Calibri" w:cs="Calibri"/>
+          <w:b/>
+          <w:sz w:val="30"/>
+        </w:rPr>
+        <w:t xml:space="preserve">in </w:t>
+      </w:r>
+    </w:p>
+    <w:p>
+      <w:pPr>
+        <w:spacing w:after="35" w:line="259" w:lineRule="auto"/>
+        <w:ind w:left="48"/>
         <w:jc w:val="center"/>
       </w:pPr>
-    </w:p>
-    <w:p>
-      <w:pPr>
+      <w:r>
+        <w:t xml:space="preserve">  </w:t>
+      </w:r>
+    </w:p>
+    <w:p>
+      <w:pPr>
+        <w:spacing w:after="9" w:line="259" w:lineRule="auto"/>
+        <w:ind w:right="51"/>
         <w:jc w:val="center"/>
       </w:pPr>
       <w:r>
-        <w:t>Prepared for the Radiology Department</w:t>
-      </w:r>
-    </w:p>
-    <w:p>
-      <w:pPr>
+        <w:rPr>
+          <w:rFonts w:ascii="Calibri" w:eastAsia="Calibri" w:hAnsi="Calibri" w:cs="Calibri"/>
+          <w:b/>
+          <w:sz w:val="28"/>
+        </w:rPr>
+        <w:t xml:space="preserve">CS 17/L </w:t>
+      </w:r>
+    </w:p>
+    <w:p>
+      <w:pPr>
+        <w:spacing w:after="0" w:line="259" w:lineRule="auto"/>
+        <w:ind w:left="92"/>
         <w:jc w:val="center"/>
       </w:pPr>
       <w:r>
-        <w:t>Tagum Global Medical Center Inc</w:t>
+        <w:rPr>
+          <w:rFonts w:ascii="Calibri" w:eastAsia="Calibri" w:hAnsi="Calibri" w:cs="Calibri"/>
+          <w:b/>
+          <w:sz w:val="32"/>
+        </w:rPr>
+        <w:t xml:space="preserve">  </w:t>
+      </w:r>
+    </w:p>
+    <w:p>
+      <w:pPr>
+        <w:pStyle w:val="Heading1"/>
+        <w:jc w:val="center"/>
+      </w:pPr>
+      <w:r>
+        <w:t>SOFTWARE ENGINEERING 2</w:t>
+      </w:r>
+    </w:p>
+    <w:p>
+      <w:pPr>
+        <w:spacing w:after="0" w:line="259" w:lineRule="auto"/>
+        <w:ind w:left="20"/>
+        <w:jc w:val="center"/>
+      </w:pPr>
+      <w:r>
+        <w:rPr>
+          <w:rFonts w:ascii="Calibri" w:eastAsia="Calibri" w:hAnsi="Calibri" w:cs="Calibri"/>
+          <w:b/>
+          <w:sz w:val="32"/>
+        </w:rPr>
+        <w:t xml:space="preserve"> </w:t>
+      </w:r>
+    </w:p>
+    <w:p>
+      <w:pPr>
+        <w:spacing w:after="0" w:line="259" w:lineRule="auto"/>
+        <w:jc w:val="center"/>
+      </w:pPr>
+      <w:r>
+        <w:rPr>
+          <w:rFonts w:ascii="Calibri" w:eastAsia="Calibri" w:hAnsi="Calibri" w:cs="Calibri"/>
+          <w:b/>
+        </w:rPr>
+        <w:t xml:space="preserve">TGMCI Radiology Queueing </w:t>
+      </w:r>
+      <w:r>
+        <w:rPr>
+          <w:rFonts w:ascii="Calibri" w:eastAsia="Calibri" w:hAnsi="Calibri" w:cs="Calibri"/>
+          <w:b/>
+        </w:rPr>
+        <w:t>System</w:t>
+      </w:r>
+      <w:r>
+        <w:rPr>
+          <w:rFonts w:ascii="Calibri" w:eastAsia="Calibri" w:hAnsi="Calibri" w:cs="Calibri"/>
+          <w:b/>
+        </w:rPr>
+        <w:t xml:space="preserve"> </w:t>
+      </w:r>
+    </w:p>
+    <w:p>
+      <w:pPr>
+        <w:spacing w:after="0" w:line="239" w:lineRule="auto"/>
+        <w:ind w:right="4105"/>
+      </w:pPr>
+      <w:r>
+        <w:rPr>
+          <w:rFonts w:ascii="Calibri" w:eastAsia="Calibri" w:hAnsi="Calibri" w:cs="Calibri"/>
+          <w:b/>
+        </w:rPr>
+        <w:t xml:space="preserve">    </w:t>
+      </w:r>
+    </w:p>
+    <w:p>
+      <w:pPr>
+        <w:spacing w:after="0" w:line="259" w:lineRule="auto"/>
+        <w:ind w:left="48"/>
+        <w:jc w:val="center"/>
+      </w:pPr>
+      <w:r>
+        <w:rPr>
+          <w:rFonts w:ascii="Calibri" w:eastAsia="Calibri" w:hAnsi="Calibri" w:cs="Calibri"/>
+          <w:b/>
+        </w:rPr>
+        <w:t xml:space="preserve">  </w:t>
+      </w:r>
+    </w:p>
+    <w:p>
+      <w:pPr>
+        <w:spacing w:after="0" w:line="259" w:lineRule="auto"/>
+        <w:jc w:val="center"/>
+      </w:pPr>
+      <w:r>
+        <w:t xml:space="preserve">Submitted to: </w:t>
+      </w:r>
+    </w:p>
+    <w:p>
+      <w:pPr>
+        <w:spacing w:after="0" w:line="259" w:lineRule="auto"/>
+        <w:ind w:left="48"/>
+        <w:jc w:val="center"/>
+      </w:pPr>
+      <w:r>
+        <w:t xml:space="preserve">  </w:t>
+      </w:r>
+    </w:p>
+    <w:p>
+      <w:pPr>
+        <w:spacing w:after="0" w:line="265" w:lineRule="auto"/>
+        <w:ind w:right="56"/>
+        <w:jc w:val="center"/>
+      </w:pPr>
+      <w:r>
+        <w:rPr>
+          <w:rFonts w:ascii="Calibri" w:eastAsia="Calibri" w:hAnsi="Calibri" w:cs="Calibri"/>
+          <w:b/>
+          <w:sz w:val="20"/>
+        </w:rPr>
+        <w:t xml:space="preserve">IRIS MAE C. MENDOZA, MIT </w:t>
+      </w:r>
+    </w:p>
+    <w:p>
+      <w:pPr>
+        <w:spacing w:after="0" w:line="259" w:lineRule="auto"/>
+        <w:ind w:left="39"/>
+        <w:jc w:val="center"/>
+      </w:pPr>
+      <w:r>
+        <w:rPr>
+          <w:rFonts w:ascii="Calibri" w:eastAsia="Calibri" w:hAnsi="Calibri" w:cs="Calibri"/>
+          <w:b/>
+          <w:sz w:val="20"/>
+        </w:rPr>
+        <w:t xml:space="preserve">  </w:t>
+      </w:r>
+    </w:p>
+    <w:p>
+      <w:pPr>
+        <w:spacing w:after="0" w:line="259" w:lineRule="auto"/>
+        <w:ind w:left="39"/>
+        <w:jc w:val="center"/>
+      </w:pPr>
+      <w:r>
+        <w:rPr>
+          <w:rFonts w:ascii="Calibri" w:eastAsia="Calibri" w:hAnsi="Calibri" w:cs="Calibri"/>
+          <w:b/>
+          <w:sz w:val="20"/>
+        </w:rPr>
+        <w:t xml:space="preserve">  </w:t>
+      </w:r>
+    </w:p>
+    <w:p>
+      <w:pPr>
+        <w:spacing w:after="0" w:line="259" w:lineRule="auto"/>
+        <w:ind w:left="39"/>
+        <w:jc w:val="center"/>
+      </w:pPr>
+      <w:r>
+        <w:rPr>
+          <w:rFonts w:ascii="Calibri" w:eastAsia="Calibri" w:hAnsi="Calibri" w:cs="Calibri"/>
+          <w:b/>
+          <w:sz w:val="20"/>
+        </w:rPr>
+        <w:t xml:space="preserve">  </w:t>
+      </w:r>
+    </w:p>
+    <w:p>
+      <w:pPr>
+        <w:spacing w:after="0" w:line="259" w:lineRule="auto"/>
+        <w:ind w:right="49"/>
+        <w:jc w:val="center"/>
+      </w:pPr>
+      <w:r>
+        <w:t xml:space="preserve">Submitted by: </w:t>
+      </w:r>
+    </w:p>
+    <w:p>
+      <w:pPr>
+        <w:spacing w:after="0" w:line="259" w:lineRule="auto"/>
+      </w:pPr>
+      <w:r>
+        <w:t xml:space="preserve">  </w:t>
+      </w:r>
+    </w:p>
+    <w:p>
+      <w:pPr>
+        <w:spacing w:after="0" w:line="265" w:lineRule="auto"/>
+        <w:ind w:right="55"/>
+        <w:jc w:val="center"/>
+      </w:pPr>
+      <w:r>
+        <w:rPr>
+          <w:rFonts w:ascii="Calibri" w:eastAsia="Calibri" w:hAnsi="Calibri" w:cs="Calibri"/>
+          <w:b/>
+          <w:sz w:val="20"/>
+        </w:rPr>
+        <w:t xml:space="preserve">MABANSAG, JEHOZAPHAT EMMANUELL G. </w:t>
+      </w:r>
+    </w:p>
+    <w:p>
+      <w:pPr>
+        <w:spacing w:after="0" w:line="265" w:lineRule="auto"/>
+        <w:ind w:right="56"/>
+        <w:jc w:val="center"/>
+      </w:pPr>
+      <w:r>
+        <w:rPr>
+          <w:rFonts w:ascii="Calibri" w:eastAsia="Calibri" w:hAnsi="Calibri" w:cs="Calibri"/>
+          <w:b/>
+          <w:sz w:val="20"/>
+        </w:rPr>
+        <w:t xml:space="preserve">GUIBONE, GLENER A. </w:t>
+      </w:r>
+    </w:p>
+    <w:p>
+      <w:pPr>
+        <w:spacing w:after="0" w:line="265" w:lineRule="auto"/>
+        <w:ind w:right="56"/>
+        <w:jc w:val="center"/>
+      </w:pPr>
+      <w:r>
+        <w:rPr>
+          <w:rFonts w:ascii="Calibri" w:eastAsia="Calibri" w:hAnsi="Calibri" w:cs="Calibri"/>
+          <w:b/>
+          <w:sz w:val="20"/>
+        </w:rPr>
+        <w:t xml:space="preserve">MARTOS, EMMANUEL M. </w:t>
+      </w:r>
+    </w:p>
+    <w:p>
+      <w:pPr>
+        <w:spacing w:after="0" w:line="265" w:lineRule="auto"/>
+        <w:jc w:val="center"/>
+      </w:pPr>
+      <w:r>
+        <w:rPr>
+          <w:rFonts w:ascii="Calibri" w:eastAsia="Calibri" w:hAnsi="Calibri" w:cs="Calibri"/>
+          <w:b/>
+          <w:sz w:val="20"/>
+        </w:rPr>
+        <w:t xml:space="preserve">DUMDUM, JACOB GABRIEL A.  </w:t>
       </w:r>
     </w:p>
     <w:p>
@@ -1702,7 +1999,15 @@
         <w:jc w:val="both"/>
       </w:pPr>
       <w:r>
-        <w:t>The TGMCI Radiology Queueing System supports the Radiology Department of Tagum Global Medical Center Inc. It coordinates queue tickets for X-Ray, Ultrasound, and CT Scan and provides a shared view for reception personnel, radiology staff, administrators, and patients waiting for service. Its purpose is to organize service flow and make the current queue visible across connected workstations.</w:t>
+        <w:t xml:space="preserve">The TGMCI Radiology Queueing System supports the Radiology Department of Tagum Global Medical Center Inc. It coordinates queue tickets for X-Ray, Ultrasound, and </w:t>
+      </w:r>
+      <w:proofErr w:type="gramStart"/>
+      <w:r>
+        <w:t>CT Scan</w:t>
+      </w:r>
+      <w:proofErr w:type="gramEnd"/>
+      <w:r>
+        <w:t xml:space="preserve"> and provides a shared view for reception personnel, radiology staff, administrators, and patients waiting for service. Its purpose is to organize service flow and make the current queue visible across connected workstations.</w:t>
       </w:r>
     </w:p>
     <w:p>
@@ -1770,80 +2075,67 @@
       </w:r>
     </w:p>
     <w:p>
-      <w:r>
-        <w:br w:type="page"/>
-      </w:r>
-    </w:p>
-    <w:p>
       <w:pPr>
         <w:pStyle w:val="Heading2"/>
       </w:pPr>
       <w:r>
+        <w:t>Objectives of the System</w:t>
+      </w:r>
+    </w:p>
+    <w:p>
+      <w:pPr>
+        <w:pStyle w:val="ListBullet"/>
+      </w:pPr>
+      <w:r>
+        <w:t>Generate a procedure-specific queue number after reception selects a procedure and patient category.</w:t>
+      </w:r>
+    </w:p>
+    <w:p>
+      <w:pPr>
+        <w:pStyle w:val="ListBullet"/>
+      </w:pPr>
+      <w:r>
+        <w:t>Select IPD tickets before OPD tickets within a procedure and use first-in, first-out ordering within each category.</w:t>
+      </w:r>
+    </w:p>
+    <w:p>
+      <w:pPr>
+        <w:pStyle w:val="ListBullet"/>
+      </w:pPr>
+      <w:r>
+        <w:t>Allow authorized radiology staff to call a waiting ticket and complete an active service.</w:t>
+      </w:r>
+    </w:p>
+    <w:p>
+      <w:pPr>
+        <w:pStyle w:val="ListBullet"/>
+      </w:pPr>
+      <w:r>
+        <w:t>Refresh staff and public queue views from a common server-side source.</w:t>
+      </w:r>
+    </w:p>
+    <w:p>
+      <w:pPr>
+        <w:pStyle w:val="ListBullet"/>
+      </w:pPr>
+      <w:r>
+        <w:t>Retain issue, call, and completion events and provide date-filtered reports.</w:t>
+      </w:r>
+    </w:p>
+    <w:p>
+      <w:pPr>
+        <w:pStyle w:val="ListBullet"/>
+      </w:pPr>
+      <w:r>
+        <w:t>Support announcement images, videos, and online media links with playback controls.</w:t>
+      </w:r>
+    </w:p>
+    <w:p>
+      <w:pPr>
+        <w:pStyle w:val="Heading2"/>
+      </w:pPr>
+      <w:r>
         <w:lastRenderedPageBreak/>
-        <w:t>A. BUSINESS REQUIREMENTS continued</w:t>
-      </w:r>
-    </w:p>
-    <w:p>
-      <w:pPr>
-        <w:pStyle w:val="Heading2"/>
-      </w:pPr>
-      <w:r>
-        <w:t>Objectives of the System</w:t>
-      </w:r>
-    </w:p>
-    <w:p>
-      <w:pPr>
-        <w:pStyle w:val="ListBullet"/>
-      </w:pPr>
-      <w:r>
-        <w:t>Generate a procedure-specific queue number after reception selects a procedure and patient category.</w:t>
-      </w:r>
-    </w:p>
-    <w:p>
-      <w:pPr>
-        <w:pStyle w:val="ListBullet"/>
-      </w:pPr>
-      <w:r>
-        <w:t>Select IPD tickets before OPD tickets within a procedure and use first-in, first-out ordering within each category.</w:t>
-      </w:r>
-    </w:p>
-    <w:p>
-      <w:pPr>
-        <w:pStyle w:val="ListBullet"/>
-      </w:pPr>
-      <w:r>
-        <w:t>Allow authorized radiology staff to call a waiting ticket and complete an active service.</w:t>
-      </w:r>
-    </w:p>
-    <w:p>
-      <w:pPr>
-        <w:pStyle w:val="ListBullet"/>
-      </w:pPr>
-      <w:r>
-        <w:t>Refresh staff and public queue views from a common server-side source.</w:t>
-      </w:r>
-    </w:p>
-    <w:p>
-      <w:pPr>
-        <w:pStyle w:val="ListBullet"/>
-      </w:pPr>
-      <w:r>
-        <w:t>Retain issue, call, and completion events and provide date-filtered reports.</w:t>
-      </w:r>
-    </w:p>
-    <w:p>
-      <w:pPr>
-        <w:pStyle w:val="ListBullet"/>
-      </w:pPr>
-      <w:r>
-        <w:t>Support announcement images, videos, and online media links with playback controls.</w:t>
-      </w:r>
-    </w:p>
-    <w:p>
-      <w:pPr>
-        <w:pStyle w:val="Heading2"/>
-      </w:pPr>
-      <w:r>
         <w:t>Scope and Limitations</w:t>
       </w:r>
     </w:p>
@@ -2134,20 +2426,6 @@
       </w:pPr>
       <w:r>
         <w:t>The intended role model must be enforced by server checks as well as interface visibility. The current queue endpoints check staff roles, while specific room assignments are represented in the interface. The release tests must verify these distinctions.</w:t>
-      </w:r>
-    </w:p>
-    <w:p>
-      <w:r>
-        <w:br w:type="page"/>
-      </w:r>
-    </w:p>
-    <w:p>
-      <w:pPr>
-        <w:pStyle w:val="Heading2"/>
-      </w:pPr>
-      <w:r>
-        <w:lastRenderedPageBreak/>
-        <w:t>B. USER REQUIREMENTS continued</w:t>
       </w:r>
     </w:p>
     <w:p>
@@ -2332,7 +2610,21 @@
               <w:rPr>
                 <w:sz w:val="20"/>
               </w:rPr>
-              <w:t>Choose X-Ray, Ultrasound, or CT Scan and IPD or OPD before generating a number.</w:t>
+              <w:t xml:space="preserve">Choose X-Ray, Ultrasound, or </w:t>
+            </w:r>
+            <w:proofErr w:type="gramStart"/>
+            <w:r>
+              <w:rPr>
+                <w:sz w:val="20"/>
+              </w:rPr>
+              <w:t>CT Scan</w:t>
+            </w:r>
+            <w:proofErr w:type="gramEnd"/>
+            <w:r>
+              <w:rPr>
+                <w:sz w:val="20"/>
+              </w:rPr>
+              <w:t xml:space="preserve"> and IPD or OPD before generating a number.</w:t>
             </w:r>
           </w:p>
         </w:tc>
@@ -2565,6 +2857,7 @@
               <w:rPr>
                 <w:sz w:val="20"/>
               </w:rPr>
+              <w:lastRenderedPageBreak/>
               <w:t>UR P2</w:t>
             </w:r>
           </w:p>
@@ -2790,7 +3083,21 @@
               <w:rPr>
                 <w:sz w:val="20"/>
               </w:rPr>
-              <w:t>Identify the appropriate X-Ray, Ultrasound, or CT Scan serving slot.</w:t>
+              <w:t xml:space="preserve">Identify the appropriate X-Ray, Ultrasound, or </w:t>
+            </w:r>
+            <w:proofErr w:type="gramStart"/>
+            <w:r>
+              <w:rPr>
+                <w:sz w:val="20"/>
+              </w:rPr>
+              <w:t>CT Scan</w:t>
+            </w:r>
+            <w:proofErr w:type="gramEnd"/>
+            <w:r>
+              <w:rPr>
+                <w:sz w:val="20"/>
+              </w:rPr>
+              <w:t xml:space="preserve"> serving slot.</w:t>
             </w:r>
           </w:p>
         </w:tc>
@@ -3150,7 +3457,21 @@
               <w:rPr>
                 <w:sz w:val="20"/>
               </w:rPr>
-              <w:t>Restrict ticket creation to receptionists and administrators.</w:t>
+              <w:t xml:space="preserve">Restrict ticket creation </w:t>
+            </w:r>
+            <w:proofErr w:type="gramStart"/>
+            <w:r>
+              <w:rPr>
+                <w:sz w:val="20"/>
+              </w:rPr>
+              <w:t>to</w:t>
+            </w:r>
+            <w:proofErr w:type="gramEnd"/>
+            <w:r>
+              <w:rPr>
+                <w:sz w:val="20"/>
+              </w:rPr>
+              <w:t xml:space="preserve"> receptionists and administrators.</w:t>
             </w:r>
           </w:p>
         </w:tc>
@@ -3325,7 +3646,21 @@
               <w:rPr>
                 <w:sz w:val="20"/>
               </w:rPr>
-              <w:t>IPD precedes OPD; older tickets precede newer tickets in the same category.</w:t>
+              <w:t xml:space="preserve">IPD precedes OPD; older tickets </w:t>
+            </w:r>
+            <w:proofErr w:type="gramStart"/>
+            <w:r>
+              <w:rPr>
+                <w:sz w:val="20"/>
+              </w:rPr>
+              <w:t>precede</w:t>
+            </w:r>
+            <w:proofErr w:type="gramEnd"/>
+            <w:r>
+              <w:rPr>
+                <w:sz w:val="20"/>
+              </w:rPr>
+              <w:t xml:space="preserve"> newer tickets in the same category.</w:t>
             </w:r>
           </w:p>
         </w:tc>
@@ -3501,20 +3836,6 @@
       </w:pPr>
       <w:r>
         <w:t>Requirements describe the intended accepted behavior. FR 04 requires correction of the schema and code mismatch before it can be accepted. Attribution of the issued event also needs correction to use the signed-in staff member.</w:t>
-      </w:r>
-    </w:p>
-    <w:p>
-      <w:r>
-        <w:br w:type="page"/>
-      </w:r>
-    </w:p>
-    <w:p>
-      <w:pPr>
-        <w:pStyle w:val="Heading2"/>
-      </w:pPr>
-      <w:r>
-        <w:lastRenderedPageBreak/>
-        <w:t>C. SYSTEM REQUIREMENTS continued</w:t>
       </w:r>
     </w:p>
     <w:p>
@@ -3879,6 +4200,7 @@
               <w:rPr>
                 <w:sz w:val="20"/>
               </w:rPr>
+              <w:lastRenderedPageBreak/>
               <w:t>FR 14</w:t>
             </w:r>
           </w:p>
@@ -4041,7 +4363,23 @@
         <w:jc w:val="both"/>
       </w:pPr>
       <w:r>
-        <w:t>Waiting to Serving and Serving to Completed are exposed by the current routes. Although the schema includes skipped and cancelled values, the checked-in route set does not provide skip or cancellation actions. Staff account maintenance and a comprehensive audit administration interface are not implemented as dashboard modules.</w:t>
+        <w:t xml:space="preserve">Waiting to </w:t>
+      </w:r>
+      <w:proofErr w:type="gramStart"/>
+      <w:r>
+        <w:t>Serving</w:t>
+      </w:r>
+      <w:proofErr w:type="gramEnd"/>
+      <w:r>
+        <w:t xml:space="preserve"> and Serving to Completed are exposed by the current routes. Although the </w:t>
+      </w:r>
+      <w:proofErr w:type="gramStart"/>
+      <w:r>
+        <w:t>schema</w:t>
+      </w:r>
+      <w:proofErr w:type="gramEnd"/>
+      <w:r>
+        <w:t xml:space="preserve"> includes skipped and cancelled values, the checked-in route set does not provide skip or cancellation actions. Staff account maintenance and a comprehensive audit administration interface are not implemented as dashboard modules.</w:t>
       </w:r>
     </w:p>
     <w:p>
@@ -4052,10 +4390,30 @@
     <w:p>
       <w:pPr>
         <w:pStyle w:val="Heading2"/>
-      </w:pPr>
-      <w:r>
+        <w:rPr>
+          <w:szCs w:val="22"/>
+        </w:rPr>
+      </w:pPr>
+      <w:r>
+        <w:rPr>
+          <w:szCs w:val="22"/>
+        </w:rPr>
         <w:lastRenderedPageBreak/>
-        <w:t>C.2 NON FUNCTIONAL REQUIREMENTS</w:t>
+        <w:t xml:space="preserve">C.2 </w:t>
+      </w:r>
+      <w:proofErr w:type="gramStart"/>
+      <w:r>
+        <w:rPr>
+          <w:szCs w:val="22"/>
+        </w:rPr>
+        <w:t>NON FUNCTIONAL</w:t>
+      </w:r>
+      <w:proofErr w:type="gramEnd"/>
+      <w:r>
+        <w:rPr>
+          <w:szCs w:val="22"/>
+        </w:rPr>
+        <w:t xml:space="preserve"> REQUIREMENTS</w:t>
       </w:r>
     </w:p>
     <w:p>
@@ -4505,7 +4863,21 @@
               <w:rPr>
                 <w:sz w:val="20"/>
               </w:rPr>
-              <w:t>Back up MySQL and uploaded media and demonstrate a restore to a separate environment before release.</w:t>
+              <w:t xml:space="preserve">Back up MySQL and </w:t>
+            </w:r>
+            <w:proofErr w:type="gramStart"/>
+            <w:r>
+              <w:rPr>
+                <w:sz w:val="20"/>
+              </w:rPr>
+              <w:t>uploaded</w:t>
+            </w:r>
+            <w:proofErr w:type="gramEnd"/>
+            <w:r>
+              <w:rPr>
+                <w:sz w:val="20"/>
+              </w:rPr>
+              <w:t xml:space="preserve"> media and demonstrate a restore to a separate environment before release.</w:t>
             </w:r>
           </w:p>
         </w:tc>
@@ -4656,21 +5028,15 @@
         <w:jc w:val="both"/>
       </w:pPr>
       <w:r>
-        <w:t>Reception selects the procedure and patient category and issues the ticket. Radiology staff call the next eligible ticket when a room is ready, perform the service, and record completion. The public display receives refreshed queue state throughout the workflow. Printing is a browser action following successful ticket creation.</w:t>
-      </w:r>
-    </w:p>
-    <w:p>
-      <w:r>
-        <w:br w:type="page"/>
-      </w:r>
-    </w:p>
-    <w:p>
-      <w:pPr>
-        <w:pStyle w:val="Heading2"/>
-      </w:pPr>
-      <w:r>
-        <w:lastRenderedPageBreak/>
-        <w:t>D. ACTIVITY DIAGRAM continued</w:t>
+        <w:t xml:space="preserve">Reception selects the procedure and patient category and issues the ticket. Radiology staff call the next eligible ticket when a room is ready, perform the service, and record completion. The public display receives refreshed </w:t>
+      </w:r>
+      <w:proofErr w:type="gramStart"/>
+      <w:r>
+        <w:t>queue state</w:t>
+      </w:r>
+      <w:proofErr w:type="gramEnd"/>
+      <w:r>
+        <w:t xml:space="preserve"> throughout the workflow. Printing is a browser action following successful ticket creation.</w:t>
       </w:r>
     </w:p>
     <w:p>
@@ -4863,7 +5229,21 @@
               <w:rPr>
                 <w:sz w:val="20"/>
               </w:rPr>
-              <w:t>Generation becomes available in the interface.</w:t>
+              <w:t xml:space="preserve">Generation becomes available </w:t>
+            </w:r>
+            <w:proofErr w:type="gramStart"/>
+            <w:r>
+              <w:rPr>
+                <w:sz w:val="20"/>
+              </w:rPr>
+              <w:t>in</w:t>
+            </w:r>
+            <w:proofErr w:type="gramEnd"/>
+            <w:r>
+              <w:rPr>
+                <w:sz w:val="20"/>
+              </w:rPr>
+              <w:t xml:space="preserve"> the interface.</w:t>
             </w:r>
           </w:p>
         </w:tc>
@@ -5071,11 +5451,19 @@
             <w:pPr>
               <w:spacing w:before="80" w:after="100" w:line="264" w:lineRule="auto"/>
             </w:pPr>
-            <w:r>
-              <w:rPr>
-                <w:sz w:val="20"/>
-              </w:rPr>
-              <w:t>Ticket becomes completed and the room can serve another ticket.</w:t>
+            <w:proofErr w:type="gramStart"/>
+            <w:r>
+              <w:rPr>
+                <w:sz w:val="20"/>
+              </w:rPr>
+              <w:t>Ticket</w:t>
+            </w:r>
+            <w:proofErr w:type="gramEnd"/>
+            <w:r>
+              <w:rPr>
+                <w:sz w:val="20"/>
+              </w:rPr>
+              <w:t xml:space="preserve"> becomes completed and the room can serve another ticket.</w:t>
             </w:r>
           </w:p>
         </w:tc>
@@ -5144,6 +5532,7 @@
         <w:pStyle w:val="Heading2"/>
       </w:pPr>
       <w:r>
+        <w:lastRenderedPageBreak/>
         <w:t>Alternative and Failure Paths</w:t>
       </w:r>
     </w:p>
@@ -5242,21 +5631,7 @@
         <w:jc w:val="both"/>
       </w:pPr>
       <w:r>
-        <w:t>The staff actors share authentication. Reception and administrators issue tickets, while radiology staff and administrators call and complete tickets. The public monitor presents queue information to waiting patients. Account administration and backup operations are technical responsibilities outside the current dashboard use cases.</w:t>
-      </w:r>
-    </w:p>
-    <w:p>
-      <w:r>
-        <w:br w:type="page"/>
-      </w:r>
-    </w:p>
-    <w:p>
-      <w:pPr>
-        <w:pStyle w:val="Heading2"/>
-      </w:pPr>
-      <w:r>
-        <w:lastRenderedPageBreak/>
-        <w:t>E. USE CASE DESCRIPTIONS</w:t>
+        <w:t>The staff actors share authentication. Reception and administrators issue tickets, while radiology staff and administrators call and complete tickets. The public monitor presents queue information to waiting patients. Account administration and backup operations are technical responsibilities outside the current dashboard use cases</w:t>
       </w:r>
     </w:p>
     <w:p>
@@ -5478,7 +5853,21 @@
               <w:rPr>
                 <w:sz w:val="20"/>
               </w:rPr>
-              <w:t>Radiology staff or administrator is signed in; a waiting ticket exists.</w:t>
+              <w:t xml:space="preserve">Radiology staff or administrator </w:t>
+            </w:r>
+            <w:proofErr w:type="gramStart"/>
+            <w:r>
+              <w:rPr>
+                <w:sz w:val="20"/>
+              </w:rPr>
+              <w:t>is</w:t>
+            </w:r>
+            <w:proofErr w:type="gramEnd"/>
+            <w:r>
+              <w:rPr>
+                <w:sz w:val="20"/>
+              </w:rPr>
+              <w:t xml:space="preserve"> signed in; a waiting ticket exists.</w:t>
             </w:r>
           </w:p>
         </w:tc>
@@ -5543,11 +5932,33 @@
             <w:pPr>
               <w:spacing w:before="80" w:after="100" w:line="264" w:lineRule="auto"/>
             </w:pPr>
-            <w:r>
-              <w:rPr>
-                <w:sz w:val="20"/>
-              </w:rPr>
-              <w:t>Ticket becomes completed and receives completion time and event.</w:t>
+            <w:proofErr w:type="gramStart"/>
+            <w:r>
+              <w:rPr>
+                <w:sz w:val="20"/>
+              </w:rPr>
+              <w:t>Ticket becomes</w:t>
+            </w:r>
+            <w:proofErr w:type="gramEnd"/>
+            <w:r>
+              <w:rPr>
+                <w:sz w:val="20"/>
+              </w:rPr>
+              <w:t xml:space="preserve"> completed and </w:t>
+            </w:r>
+            <w:proofErr w:type="gramStart"/>
+            <w:r>
+              <w:rPr>
+                <w:sz w:val="20"/>
+              </w:rPr>
+              <w:t>receives</w:t>
+            </w:r>
+            <w:proofErr w:type="gramEnd"/>
+            <w:r>
+              <w:rPr>
+                <w:sz w:val="20"/>
+              </w:rPr>
+              <w:t xml:space="preserve"> completion time and event.</w:t>
             </w:r>
           </w:p>
         </w:tc>
@@ -5674,6 +6085,7 @@
               <w:rPr>
                 <w:sz w:val="20"/>
               </w:rPr>
+              <w:lastRenderedPageBreak/>
               <w:t>UC 07 View public queue</w:t>
             </w:r>
           </w:p>
@@ -5804,7 +6216,15 @@
         <w:jc w:val="both"/>
       </w:pPr>
       <w:r>
-        <w:t>Reception supplies ticket selections and receives the issued code and current queue information. Radiology staff supply call and completion commands and receive updated service state. Administrators provide media and report filters and receive metadata, status, and summaries. Waiting patients receive the rendered public queue and announcements.</w:t>
+        <w:t xml:space="preserve">Reception supplies ticket selections and receives the issued code and current queue information. Radiology staff supply </w:t>
+      </w:r>
+      <w:proofErr w:type="gramStart"/>
+      <w:r>
+        <w:t>call</w:t>
+      </w:r>
+      <w:proofErr w:type="gramEnd"/>
+      <w:r>
+        <w:t xml:space="preserve"> and completion commands and receive updated service state. Administrators provide media and report filters and receive metadata, status, and summaries. Waiting patients receive the rendered public queue and announcements.</w:t>
       </w:r>
     </w:p>
     <w:p>
@@ -5974,21 +6394,15 @@
         <w:jc w:val="both"/>
       </w:pPr>
       <w:r>
-        <w:t>An iterative development process is appropriate for this application because the repository contains successive designs and implementation changes for authentication, queue handling, reporting, and media playback. Each increment should refine a defined workflow, update the schema when needed, and validate the result before the next release. The diagram defines a repeatable process for continuing the project; it does not assert that unrecorded interviews or acceptance activities have occurred.</w:t>
-      </w:r>
-    </w:p>
-    <w:p>
-      <w:r>
-        <w:br w:type="page"/>
-      </w:r>
-    </w:p>
-    <w:p>
-      <w:pPr>
-        <w:pStyle w:val="Heading2"/>
-      </w:pPr>
-      <w:r>
-        <w:lastRenderedPageBreak/>
-        <w:t>G. IMPLEMENTATION TECHNOLOGIES</w:t>
+        <w:t xml:space="preserve">An iterative development process is appropriate for this application because the repository contains successive designs and implementation changes for authentication, queue handling, reporting, and media playback. Each increment should refine a defined workflow, update the schema when </w:t>
+      </w:r>
+      <w:proofErr w:type="gramStart"/>
+      <w:r>
+        <w:t>needed</w:t>
+      </w:r>
+      <w:proofErr w:type="gramEnd"/>
+      <w:r>
+        <w:t>, and validate the result before the next release. The diagram defines a repeatable process for continuing the project; it does not assert that unrecorded interviews or acceptance activities have occurred.</w:t>
       </w:r>
     </w:p>
     <w:p>
@@ -6160,7 +6574,21 @@
               <w:rPr>
                 <w:sz w:val="20"/>
               </w:rPr>
-              <w:t>Relational persistence and prepared queries. SQL scripts specify InnoDB and utf8mb4.</w:t>
+              <w:t xml:space="preserve">Relational persistence and prepared queries. SQL scripts specify </w:t>
+            </w:r>
+            <w:proofErr w:type="spellStart"/>
+            <w:r>
+              <w:rPr>
+                <w:sz w:val="20"/>
+              </w:rPr>
+              <w:t>InnoDB</w:t>
+            </w:r>
+            <w:proofErr w:type="spellEnd"/>
+            <w:r>
+              <w:rPr>
+                <w:sz w:val="20"/>
+              </w:rPr>
+              <w:t xml:space="preserve"> and utf8mb4.</w:t>
             </w:r>
           </w:p>
         </w:tc>
@@ -6214,11 +6642,19 @@
             <w:pPr>
               <w:spacing w:before="80" w:after="100" w:line="264" w:lineRule="auto"/>
             </w:pPr>
-            <w:r>
-              <w:rPr>
-                <w:sz w:val="20"/>
-              </w:rPr>
-              <w:t>SheetJS browser library</w:t>
+            <w:proofErr w:type="spellStart"/>
+            <w:r>
+              <w:rPr>
+                <w:sz w:val="20"/>
+              </w:rPr>
+              <w:t>SheetJS</w:t>
+            </w:r>
+            <w:proofErr w:type="spellEnd"/>
+            <w:r>
+              <w:rPr>
+                <w:sz w:val="20"/>
+              </w:rPr>
+              <w:t xml:space="preserve"> browser library</w:t>
             </w:r>
           </w:p>
         </w:tc>
@@ -6329,6 +6765,7 @@
               <w:rPr>
                 <w:sz w:val="20"/>
               </w:rPr>
+              <w:lastRenderedPageBreak/>
               <w:t>Node test runner</w:t>
             </w:r>
           </w:p>
@@ -6533,7 +6970,15 @@
         <w:jc w:val="both"/>
       </w:pPr>
       <w:r>
-        <w:t>Staff workstations and the public monitor connect to one PHP application host on the hospital LAN. The web server document root is public/. The application accesses MySQL through PDO and reads or writes local media and JSON state. The PHP bootstrap sets Asia/Manila, and the database connection sets the session offset to +08:00. Online media and CDN resources require separate internet connectivity.</w:t>
+        <w:t xml:space="preserve">Staff workstations and the public monitor connect to one PHP application host on the hospital LAN. The web server document root is </w:t>
+      </w:r>
+      <w:proofErr w:type="gramStart"/>
+      <w:r>
+        <w:t>public/.</w:t>
+      </w:r>
+      <w:proofErr w:type="gramEnd"/>
+      <w:r>
+        <w:t xml:space="preserve"> The application accesses MySQL through PDO and reads or writes local media and JSON state. The PHP bootstrap sets Asia/Manila, and the database connection sets the session offset to +08:00. Online media and CDN resources require separate internet connectivity.</w:t>
       </w:r>
     </w:p>
     <w:p>
@@ -6623,21 +7068,31 @@
         <w:jc w:val="both"/>
       </w:pPr>
       <w:r>
-        <w:t>The checked-in schema contains eight tables. Procedures and categories classify tickets; staff users issue tickets and act on queue events. Daily counters allocate procedure sequences. Advertisements store media metadata. Audit logs reference staff users but do not declare an advertisement foreign key. Queue events also reference staff_users through actor_id; this additional relationship is described here to keep the diagram readable.</w:t>
-      </w:r>
-    </w:p>
-    <w:p>
-      <w:r>
-        <w:br w:type="page"/>
-      </w:r>
-    </w:p>
-    <w:p>
-      <w:pPr>
-        <w:pStyle w:val="Heading2"/>
-      </w:pPr>
-      <w:r>
-        <w:lastRenderedPageBreak/>
-        <w:t>J. DATA DICTIONARY</w:t>
+        <w:t xml:space="preserve">The </w:t>
+      </w:r>
+      <w:proofErr w:type="gramStart"/>
+      <w:r>
+        <w:t>checked</w:t>
+      </w:r>
+      <w:proofErr w:type="gramEnd"/>
+      <w:r>
+        <w:t xml:space="preserve">-in schema contains eight tables. Procedures and categories classify tickets; staff users issue tickets and act on queue events. Daily counters allocate procedure sequences. Advertisements store media metadata. Audit logs reference staff users but do not declare an advertisement foreign key. Queue events also reference </w:t>
+      </w:r>
+      <w:proofErr w:type="spellStart"/>
+      <w:r>
+        <w:t>staff_users</w:t>
+      </w:r>
+      <w:proofErr w:type="spellEnd"/>
+      <w:r>
+        <w:t xml:space="preserve"> through </w:t>
+      </w:r>
+      <w:proofErr w:type="spellStart"/>
+      <w:r>
+        <w:t>actor_id</w:t>
+      </w:r>
+      <w:proofErr w:type="spellEnd"/>
+      <w:r>
+        <w:t>; this additional relationship is described here to keep the diagram readable.</w:t>
       </w:r>
     </w:p>
     <w:p>
@@ -6733,12 +7188,14 @@
             <w:pPr>
               <w:spacing w:before="80" w:after="100" w:line="264" w:lineRule="auto"/>
             </w:pPr>
+            <w:proofErr w:type="spellStart"/>
             <w:r>
               <w:rPr>
                 <w:sz w:val="20"/>
               </w:rPr>
               <w:t>staff_users</w:t>
             </w:r>
+            <w:proofErr w:type="spellEnd"/>
           </w:p>
         </w:tc>
         <w:tc>
@@ -6753,7 +7210,35 @@
               <w:rPr>
                 <w:sz w:val="20"/>
               </w:rPr>
-              <w:t>id INT PK; name VARCHAR(255); role ENUM; password VARCHAR(255); timestamps</w:t>
+              <w:t xml:space="preserve">id INT PK; name </w:t>
+            </w:r>
+            <w:proofErr w:type="gramStart"/>
+            <w:r>
+              <w:rPr>
+                <w:sz w:val="20"/>
+              </w:rPr>
+              <w:t>VARCHAR(</w:t>
+            </w:r>
+            <w:proofErr w:type="gramEnd"/>
+            <w:r>
+              <w:rPr>
+                <w:sz w:val="20"/>
+              </w:rPr>
+              <w:t xml:space="preserve">255); role ENUM; password </w:t>
+            </w:r>
+            <w:proofErr w:type="gramStart"/>
+            <w:r>
+              <w:rPr>
+                <w:sz w:val="20"/>
+              </w:rPr>
+              <w:t>VARCHAR(</w:t>
+            </w:r>
+            <w:proofErr w:type="gramEnd"/>
+            <w:r>
+              <w:rPr>
+                <w:sz w:val="20"/>
+              </w:rPr>
+              <w:t>255); timestamps</w:t>
             </w:r>
           </w:p>
         </w:tc>
@@ -6769,7 +7254,21 @@
               <w:rPr>
                 <w:sz w:val="20"/>
               </w:rPr>
-              <w:t>Staff identity and password hash. Roles are receptionist, radiology_staff, administrator.</w:t>
+              <w:t xml:space="preserve">Staff identity and password hash. Roles are receptionist, </w:t>
+            </w:r>
+            <w:proofErr w:type="spellStart"/>
+            <w:r>
+              <w:rPr>
+                <w:sz w:val="20"/>
+              </w:rPr>
+              <w:t>radiology_staff</w:t>
+            </w:r>
+            <w:proofErr w:type="spellEnd"/>
+            <w:r>
+              <w:rPr>
+                <w:sz w:val="20"/>
+              </w:rPr>
+              <w:t>, administrator.</w:t>
             </w:r>
           </w:p>
         </w:tc>
@@ -6806,7 +7305,35 @@
               <w:rPr>
                 <w:sz w:val="20"/>
               </w:rPr>
-              <w:t>id INT PK; code VARCHAR(50) UNIQUE; name VARCHAR(255); timestamps</w:t>
+              <w:t xml:space="preserve">id INT PK; code </w:t>
+            </w:r>
+            <w:proofErr w:type="gramStart"/>
+            <w:r>
+              <w:rPr>
+                <w:sz w:val="20"/>
+              </w:rPr>
+              <w:t>VARCHAR(</w:t>
+            </w:r>
+            <w:proofErr w:type="gramEnd"/>
+            <w:r>
+              <w:rPr>
+                <w:sz w:val="20"/>
+              </w:rPr>
+              <w:t xml:space="preserve">50) UNIQUE; name </w:t>
+            </w:r>
+            <w:proofErr w:type="gramStart"/>
+            <w:r>
+              <w:rPr>
+                <w:sz w:val="20"/>
+              </w:rPr>
+              <w:t>VARCHAR(</w:t>
+            </w:r>
+            <w:proofErr w:type="gramEnd"/>
+            <w:r>
+              <w:rPr>
+                <w:sz w:val="20"/>
+              </w:rPr>
+              <w:t>255); timestamps</w:t>
             </w:r>
           </w:p>
         </w:tc>
@@ -6839,12 +7366,14 @@
             <w:pPr>
               <w:spacing w:before="80" w:after="100" w:line="264" w:lineRule="auto"/>
             </w:pPr>
+            <w:proofErr w:type="spellStart"/>
             <w:r>
               <w:rPr>
                 <w:sz w:val="20"/>
               </w:rPr>
               <w:t>patient_categories</w:t>
             </w:r>
+            <w:proofErr w:type="spellEnd"/>
           </w:p>
         </w:tc>
         <w:tc>
@@ -6859,7 +7388,35 @@
               <w:rPr>
                 <w:sz w:val="20"/>
               </w:rPr>
-              <w:t>id INT PK; code VARCHAR(50) UNIQUE; priority_rank INT; timestamps</w:t>
+              <w:t xml:space="preserve">id INT PK; code </w:t>
+            </w:r>
+            <w:proofErr w:type="gramStart"/>
+            <w:r>
+              <w:rPr>
+                <w:sz w:val="20"/>
+              </w:rPr>
+              <w:t>VARCHAR(</w:t>
+            </w:r>
+            <w:proofErr w:type="gramEnd"/>
+            <w:r>
+              <w:rPr>
+                <w:sz w:val="20"/>
+              </w:rPr>
+              <w:t xml:space="preserve">50) UNIQUE; </w:t>
+            </w:r>
+            <w:proofErr w:type="spellStart"/>
+            <w:r>
+              <w:rPr>
+                <w:sz w:val="20"/>
+              </w:rPr>
+              <w:t>priority_rank</w:t>
+            </w:r>
+            <w:proofErr w:type="spellEnd"/>
+            <w:r>
+              <w:rPr>
+                <w:sz w:val="20"/>
+              </w:rPr>
+              <w:t xml:space="preserve"> INT; timestamps</w:t>
             </w:r>
           </w:p>
         </w:tc>
@@ -6892,12 +7449,14 @@
             <w:pPr>
               <w:spacing w:before="80" w:after="100" w:line="264" w:lineRule="auto"/>
             </w:pPr>
+            <w:proofErr w:type="spellStart"/>
             <w:r>
               <w:rPr>
                 <w:sz w:val="20"/>
               </w:rPr>
               <w:t>queue_counters</w:t>
             </w:r>
+            <w:proofErr w:type="spellEnd"/>
           </w:p>
         </w:tc>
         <w:tc>
@@ -6912,7 +7471,49 @@
               <w:rPr>
                 <w:sz w:val="20"/>
               </w:rPr>
-              <w:t>id INT PK; date DATE; procedure_id FK; last_sequence_number INT</w:t>
+              <w:t xml:space="preserve">id INT PK; date </w:t>
+            </w:r>
+            <w:proofErr w:type="spellStart"/>
+            <w:r>
+              <w:rPr>
+                <w:sz w:val="20"/>
+              </w:rPr>
+              <w:t>DATE</w:t>
+            </w:r>
+            <w:proofErr w:type="spellEnd"/>
+            <w:r>
+              <w:rPr>
+                <w:sz w:val="20"/>
+              </w:rPr>
+              <w:t xml:space="preserve">; </w:t>
+            </w:r>
+            <w:proofErr w:type="spellStart"/>
+            <w:r>
+              <w:rPr>
+                <w:sz w:val="20"/>
+              </w:rPr>
+              <w:t>procedure_id</w:t>
+            </w:r>
+            <w:proofErr w:type="spellEnd"/>
+            <w:r>
+              <w:rPr>
+                <w:sz w:val="20"/>
+              </w:rPr>
+              <w:t xml:space="preserve"> FK; </w:t>
+            </w:r>
+            <w:proofErr w:type="spellStart"/>
+            <w:r>
+              <w:rPr>
+                <w:sz w:val="20"/>
+              </w:rPr>
+              <w:t>last_sequence_number</w:t>
+            </w:r>
+            <w:proofErr w:type="spellEnd"/>
+            <w:r>
+              <w:rPr>
+                <w:sz w:val="20"/>
+              </w:rPr>
+              <w:t xml:space="preserve"> INT</w:t>
             </w:r>
           </w:p>
         </w:tc>
@@ -6928,7 +7529,21 @@
               <w:rPr>
                 <w:sz w:val="20"/>
               </w:rPr>
-              <w:t>Unique combination of date and procedure_id tracks daily numbering.</w:t>
+              <w:t xml:space="preserve">Unique combination of date and </w:t>
+            </w:r>
+            <w:proofErr w:type="spellStart"/>
+            <w:r>
+              <w:rPr>
+                <w:sz w:val="20"/>
+              </w:rPr>
+              <w:t>procedure_id</w:t>
+            </w:r>
+            <w:proofErr w:type="spellEnd"/>
+            <w:r>
+              <w:rPr>
+                <w:sz w:val="20"/>
+              </w:rPr>
+              <w:t xml:space="preserve"> tracks daily numbering.</w:t>
             </w:r>
           </w:p>
         </w:tc>
@@ -6936,7 +7551,8 @@
     </w:tbl>
     <w:p>
       <w:pPr>
-        <w:spacing w:after="0"/>
+        <w:keepNext/>
+        <w:jc w:val="both"/>
       </w:pPr>
     </w:p>
     <w:p>
@@ -7034,7 +7650,35 @@
               <w:rPr>
                 <w:sz w:val="20"/>
               </w:rPr>
-              <w:t>id INT primary key; ticket_code VARCHAR(100) declared globally unique.</w:t>
+              <w:t xml:space="preserve">id INT primary key; </w:t>
+            </w:r>
+            <w:proofErr w:type="spellStart"/>
+            <w:r>
+              <w:rPr>
+                <w:sz w:val="20"/>
+              </w:rPr>
+              <w:t>ticket_code</w:t>
+            </w:r>
+            <w:proofErr w:type="spellEnd"/>
+            <w:r>
+              <w:rPr>
+                <w:sz w:val="20"/>
+              </w:rPr>
+              <w:t xml:space="preserve"> </w:t>
+            </w:r>
+            <w:proofErr w:type="gramStart"/>
+            <w:r>
+              <w:rPr>
+                <w:sz w:val="20"/>
+              </w:rPr>
+              <w:t>VARCHAR(</w:t>
+            </w:r>
+            <w:proofErr w:type="gramEnd"/>
+            <w:r>
+              <w:rPr>
+                <w:sz w:val="20"/>
+              </w:rPr>
+              <w:t>100) declared globally unique.</w:t>
             </w:r>
           </w:p>
         </w:tc>
@@ -7067,11 +7711,61 @@
             <w:pPr>
               <w:spacing w:before="80" w:after="100" w:line="264" w:lineRule="auto"/>
             </w:pPr>
-            <w:r>
-              <w:rPr>
-                <w:sz w:val="20"/>
-              </w:rPr>
-              <w:t>procedure_id and category_id reference the corresponding lookup records; issuer_id references staff_users.</w:t>
+            <w:proofErr w:type="spellStart"/>
+            <w:r>
+              <w:rPr>
+                <w:sz w:val="20"/>
+              </w:rPr>
+              <w:t>procedure_id</w:t>
+            </w:r>
+            <w:proofErr w:type="spellEnd"/>
+            <w:r>
+              <w:rPr>
+                <w:sz w:val="20"/>
+              </w:rPr>
+              <w:t xml:space="preserve"> and </w:t>
+            </w:r>
+            <w:proofErr w:type="spellStart"/>
+            <w:r>
+              <w:rPr>
+                <w:sz w:val="20"/>
+              </w:rPr>
+              <w:t>category_id</w:t>
+            </w:r>
+            <w:proofErr w:type="spellEnd"/>
+            <w:r>
+              <w:rPr>
+                <w:sz w:val="20"/>
+              </w:rPr>
+              <w:t xml:space="preserve"> reference the corresponding lookup records; </w:t>
+            </w:r>
+            <w:proofErr w:type="spellStart"/>
+            <w:r>
+              <w:rPr>
+                <w:sz w:val="20"/>
+              </w:rPr>
+              <w:t>issuer_id</w:t>
+            </w:r>
+            <w:proofErr w:type="spellEnd"/>
+            <w:r>
+              <w:rPr>
+                <w:sz w:val="20"/>
+              </w:rPr>
+              <w:t xml:space="preserve"> references </w:t>
+            </w:r>
+            <w:proofErr w:type="spellStart"/>
+            <w:r>
+              <w:rPr>
+                <w:sz w:val="20"/>
+              </w:rPr>
+              <w:t>staff_users</w:t>
+            </w:r>
+            <w:proofErr w:type="spellEnd"/>
+            <w:r>
+              <w:rPr>
+                <w:sz w:val="20"/>
+              </w:rPr>
+              <w:t>.</w:t>
             </w:r>
           </w:p>
         </w:tc>
@@ -7108,7 +7802,49 @@
               <w:rPr>
                 <w:sz w:val="20"/>
               </w:rPr>
-              <w:t>status ENUM waiting, serving, completed, skipped, cancelled; issue_time defaults to current time; serving_time and completed_time are nullable.</w:t>
+              <w:t xml:space="preserve">status ENUM waiting, serving, completed, skipped, cancelled; </w:t>
+            </w:r>
+            <w:proofErr w:type="spellStart"/>
+            <w:r>
+              <w:rPr>
+                <w:sz w:val="20"/>
+              </w:rPr>
+              <w:t>issue_time</w:t>
+            </w:r>
+            <w:proofErr w:type="spellEnd"/>
+            <w:r>
+              <w:rPr>
+                <w:sz w:val="20"/>
+              </w:rPr>
+              <w:t xml:space="preserve"> defaults to current time; </w:t>
+            </w:r>
+            <w:proofErr w:type="spellStart"/>
+            <w:r>
+              <w:rPr>
+                <w:sz w:val="20"/>
+              </w:rPr>
+              <w:t>serving_time</w:t>
+            </w:r>
+            <w:proofErr w:type="spellEnd"/>
+            <w:r>
+              <w:rPr>
+                <w:sz w:val="20"/>
+              </w:rPr>
+              <w:t xml:space="preserve"> and </w:t>
+            </w:r>
+            <w:proofErr w:type="spellStart"/>
+            <w:r>
+              <w:rPr>
+                <w:sz w:val="20"/>
+              </w:rPr>
+              <w:t>completed_time</w:t>
+            </w:r>
+            <w:proofErr w:type="spellEnd"/>
+            <w:r>
+              <w:rPr>
+                <w:sz w:val="20"/>
+              </w:rPr>
+              <w:t xml:space="preserve"> are nullable.</w:t>
             </w:r>
           </w:p>
         </w:tc>
@@ -7141,35 +7877,53 @@
             <w:pPr>
               <w:spacing w:before="80" w:after="100" w:line="264" w:lineRule="auto"/>
             </w:pPr>
-            <w:r>
-              <w:rPr>
-                <w:sz w:val="20"/>
-              </w:rPr>
-              <w:t>created_at and updated_at timestamps. The runtime additionally expects serving_slot, which is absent from the supplied SQL.</w:t>
+            <w:proofErr w:type="spellStart"/>
+            <w:r>
+              <w:rPr>
+                <w:sz w:val="20"/>
+              </w:rPr>
+              <w:t>created_at</w:t>
+            </w:r>
+            <w:proofErr w:type="spellEnd"/>
+            <w:r>
+              <w:rPr>
+                <w:sz w:val="20"/>
+              </w:rPr>
+              <w:t xml:space="preserve"> and </w:t>
+            </w:r>
+            <w:proofErr w:type="spellStart"/>
+            <w:r>
+              <w:rPr>
+                <w:sz w:val="20"/>
+              </w:rPr>
+              <w:t>updated_at</w:t>
+            </w:r>
+            <w:proofErr w:type="spellEnd"/>
+            <w:r>
+              <w:rPr>
+                <w:sz w:val="20"/>
+              </w:rPr>
+              <w:t xml:space="preserve"> timestamps. The runtime additionally expects </w:t>
+            </w:r>
+            <w:proofErr w:type="spellStart"/>
+            <w:r>
+              <w:rPr>
+                <w:sz w:val="20"/>
+              </w:rPr>
+              <w:t>serving_slot</w:t>
+            </w:r>
+            <w:proofErr w:type="spellEnd"/>
+            <w:r>
+              <w:rPr>
+                <w:sz w:val="20"/>
+              </w:rPr>
+              <w:t>, which is absent from the supplied SQL.</w:t>
             </w:r>
           </w:p>
         </w:tc>
       </w:tr>
     </w:tbl>
-    <w:p>
-      <w:pPr>
-        <w:spacing w:after="0"/>
-      </w:pPr>
-    </w:p>
-    <w:p>
-      <w:r>
-        <w:br w:type="page"/>
-      </w:r>
-    </w:p>
-    <w:p>
-      <w:pPr>
-        <w:pStyle w:val="Heading2"/>
-      </w:pPr>
-      <w:r>
-        <w:lastRenderedPageBreak/>
-        <w:t>J. DATA INTEGRITY AND STORAGE</w:t>
-      </w:r>
-    </w:p>
+    <w:p/>
     <w:p>
       <w:pPr>
         <w:keepNext/>
@@ -7245,12 +7999,14 @@
             <w:pPr>
               <w:spacing w:before="80" w:after="100" w:line="264" w:lineRule="auto"/>
             </w:pPr>
+            <w:proofErr w:type="spellStart"/>
             <w:r>
               <w:rPr>
                 <w:sz w:val="20"/>
               </w:rPr>
               <w:t>queue_events</w:t>
             </w:r>
+            <w:proofErr w:type="spellEnd"/>
           </w:p>
         </w:tc>
         <w:tc>
@@ -7265,7 +8021,63 @@
               <w:rPr>
                 <w:sz w:val="20"/>
               </w:rPr>
-              <w:t>id PK; ticket_id FK; actor_id FK; action VARCHAR(255); created_at TIMESTAMP. Records issued, called, and completed actions in the implemented flows.</w:t>
+              <w:t xml:space="preserve">id PK; </w:t>
+            </w:r>
+            <w:proofErr w:type="spellStart"/>
+            <w:r>
+              <w:rPr>
+                <w:sz w:val="20"/>
+              </w:rPr>
+              <w:t>ticket_id</w:t>
+            </w:r>
+            <w:proofErr w:type="spellEnd"/>
+            <w:r>
+              <w:rPr>
+                <w:sz w:val="20"/>
+              </w:rPr>
+              <w:t xml:space="preserve"> FK; </w:t>
+            </w:r>
+            <w:proofErr w:type="spellStart"/>
+            <w:r>
+              <w:rPr>
+                <w:sz w:val="20"/>
+              </w:rPr>
+              <w:t>actor_id</w:t>
+            </w:r>
+            <w:proofErr w:type="spellEnd"/>
+            <w:r>
+              <w:rPr>
+                <w:sz w:val="20"/>
+              </w:rPr>
+              <w:t xml:space="preserve"> FK; action </w:t>
+            </w:r>
+            <w:proofErr w:type="gramStart"/>
+            <w:r>
+              <w:rPr>
+                <w:sz w:val="20"/>
+              </w:rPr>
+              <w:t>VARCHAR(</w:t>
+            </w:r>
+            <w:proofErr w:type="gramEnd"/>
+            <w:r>
+              <w:rPr>
+                <w:sz w:val="20"/>
+              </w:rPr>
+              <w:t xml:space="preserve">255); </w:t>
+            </w:r>
+            <w:proofErr w:type="spellStart"/>
+            <w:r>
+              <w:rPr>
+                <w:sz w:val="20"/>
+              </w:rPr>
+              <w:t>created_at</w:t>
+            </w:r>
+            <w:proofErr w:type="spellEnd"/>
+            <w:r>
+              <w:rPr>
+                <w:sz w:val="20"/>
+              </w:rPr>
+              <w:t xml:space="preserve"> TIMESTAMP. Records issued, called, and completed actions in the implemented flows.</w:t>
             </w:r>
           </w:p>
         </w:tc>
@@ -7302,7 +8114,77 @@
               <w:rPr>
                 <w:sz w:val="20"/>
               </w:rPr>
-              <w:t>id PK; filepath VARCHAR(255); duration_seconds INT default 10; is_active BOOLEAN default true; display_order INT default 0; timestamps.</w:t>
+              <w:t xml:space="preserve">id PK; </w:t>
+            </w:r>
+            <w:proofErr w:type="spellStart"/>
+            <w:r>
+              <w:rPr>
+                <w:sz w:val="20"/>
+              </w:rPr>
+              <w:t>filepath</w:t>
+            </w:r>
+            <w:proofErr w:type="spellEnd"/>
+            <w:r>
+              <w:rPr>
+                <w:sz w:val="20"/>
+              </w:rPr>
+              <w:t xml:space="preserve"> </w:t>
+            </w:r>
+            <w:proofErr w:type="gramStart"/>
+            <w:r>
+              <w:rPr>
+                <w:sz w:val="20"/>
+              </w:rPr>
+              <w:t>VARCHAR(</w:t>
+            </w:r>
+            <w:proofErr w:type="gramEnd"/>
+            <w:r>
+              <w:rPr>
+                <w:sz w:val="20"/>
+              </w:rPr>
+              <w:t xml:space="preserve">255); </w:t>
+            </w:r>
+            <w:proofErr w:type="spellStart"/>
+            <w:r>
+              <w:rPr>
+                <w:sz w:val="20"/>
+              </w:rPr>
+              <w:t>duration_seconds</w:t>
+            </w:r>
+            <w:proofErr w:type="spellEnd"/>
+            <w:r>
+              <w:rPr>
+                <w:sz w:val="20"/>
+              </w:rPr>
+              <w:t xml:space="preserve"> INT default 10; </w:t>
+            </w:r>
+            <w:proofErr w:type="spellStart"/>
+            <w:r>
+              <w:rPr>
+                <w:sz w:val="20"/>
+              </w:rPr>
+              <w:t>is_active</w:t>
+            </w:r>
+            <w:proofErr w:type="spellEnd"/>
+            <w:r>
+              <w:rPr>
+                <w:sz w:val="20"/>
+              </w:rPr>
+              <w:t xml:space="preserve"> BOOLEAN default true; </w:t>
+            </w:r>
+            <w:proofErr w:type="spellStart"/>
+            <w:r>
+              <w:rPr>
+                <w:sz w:val="20"/>
+              </w:rPr>
+              <w:t>display_order</w:t>
+            </w:r>
+            <w:proofErr w:type="spellEnd"/>
+            <w:r>
+              <w:rPr>
+                <w:sz w:val="20"/>
+              </w:rPr>
+              <w:t xml:space="preserve"> INT default 0; timestamps.</w:t>
             </w:r>
           </w:p>
         </w:tc>
@@ -7319,12 +8201,14 @@
             <w:pPr>
               <w:spacing w:before="80" w:after="100" w:line="264" w:lineRule="auto"/>
             </w:pPr>
+            <w:proofErr w:type="spellStart"/>
             <w:r>
               <w:rPr>
                 <w:sz w:val="20"/>
               </w:rPr>
               <w:t>audit_logs</w:t>
             </w:r>
+            <w:proofErr w:type="spellEnd"/>
           </w:p>
         </w:tc>
         <w:tc>
@@ -7339,7 +8223,49 @@
               <w:rPr>
                 <w:sz w:val="20"/>
               </w:rPr>
-              <w:t>id PK; user_id FK; action VARCHAR(255); details TEXT; created_at TIMESTAMP. No comprehensive audit-writing workflow is shown by current controllers.</w:t>
+              <w:t xml:space="preserve">id PK; </w:t>
+            </w:r>
+            <w:proofErr w:type="spellStart"/>
+            <w:r>
+              <w:rPr>
+                <w:sz w:val="20"/>
+              </w:rPr>
+              <w:t>user_id</w:t>
+            </w:r>
+            <w:proofErr w:type="spellEnd"/>
+            <w:r>
+              <w:rPr>
+                <w:sz w:val="20"/>
+              </w:rPr>
+              <w:t xml:space="preserve"> FK; action </w:t>
+            </w:r>
+            <w:proofErr w:type="gramStart"/>
+            <w:r>
+              <w:rPr>
+                <w:sz w:val="20"/>
+              </w:rPr>
+              <w:t>VARCHAR(</w:t>
+            </w:r>
+            <w:proofErr w:type="gramEnd"/>
+            <w:r>
+              <w:rPr>
+                <w:sz w:val="20"/>
+              </w:rPr>
+              <w:t xml:space="preserve">255); details TEXT; </w:t>
+            </w:r>
+            <w:proofErr w:type="spellStart"/>
+            <w:r>
+              <w:rPr>
+                <w:sz w:val="20"/>
+              </w:rPr>
+              <w:t>created_at</w:t>
+            </w:r>
+            <w:proofErr w:type="spellEnd"/>
+            <w:r>
+              <w:rPr>
+                <w:sz w:val="20"/>
+              </w:rPr>
+              <w:t xml:space="preserve"> TIMESTAMP. No comprehensive audit-writing workflow is shown by current controllers.</w:t>
             </w:r>
           </w:p>
         </w:tc>
@@ -7371,7 +8297,23 @@
         <w:jc w:val="both"/>
       </w:pPr>
       <w:r>
-        <w:t>The generated code uses a prefix and sequence such as XR-001. Because daily counters reset while ticket_code is globally unique, a fresh installation from the supplied SQL can encounter a next-day collision. The release design must choose date-scoped uniqueness or a date-bearing identifier and update code and tests consistently. This documentation does not apply a database migration.</w:t>
+        <w:t xml:space="preserve">The generated code uses a prefix and sequence such as XR-001. Because daily counters reset while </w:t>
+      </w:r>
+      <w:proofErr w:type="spellStart"/>
+      <w:r>
+        <w:t>ticket_code</w:t>
+      </w:r>
+      <w:proofErr w:type="spellEnd"/>
+      <w:r>
+        <w:t xml:space="preserve"> is globally unique, a fresh installation from the supplied SQL can encounter a next-day collision. The release design must choose date-scoped uniqueness or a date-bearing identifier and update code and tests consistently. This documentation does not apply </w:t>
+      </w:r>
+      <w:proofErr w:type="gramStart"/>
+      <w:r>
+        <w:t>a database</w:t>
+      </w:r>
+      <w:proofErr w:type="gramEnd"/>
+      <w:r>
+        <w:t xml:space="preserve"> migration.</w:t>
       </w:r>
     </w:p>
     <w:p>
@@ -7387,7 +8329,50 @@
         <w:jc w:val="both"/>
       </w:pPr>
       <w:r>
-        <w:t>Uploaded advertisements are stored under public/storage/uploads/ads/. The storage directory holds ad_command.json, ad_settings.json, and ad_playback.json. Backups must account for both database metadata and the corresponding media files. Playback state is transient operational state, not a substitute for queue history.</w:t>
+        <w:t xml:space="preserve">Uploaded advertisements are stored under public/storage/uploads/ads/. The storage directory holds </w:t>
+      </w:r>
+      <w:proofErr w:type="spellStart"/>
+      <w:r>
+        <w:t>ad_</w:t>
+      </w:r>
+      <w:proofErr w:type="gramStart"/>
+      <w:r>
+        <w:t>command.json</w:t>
+      </w:r>
+      <w:proofErr w:type="spellEnd"/>
+      <w:proofErr w:type="gramEnd"/>
+      <w:r>
+        <w:t xml:space="preserve">, </w:t>
+      </w:r>
+      <w:proofErr w:type="spellStart"/>
+      <w:r>
+        <w:t>ad_</w:t>
+      </w:r>
+      <w:proofErr w:type="gramStart"/>
+      <w:r>
+        <w:t>settings.json</w:t>
+      </w:r>
+      <w:proofErr w:type="spellEnd"/>
+      <w:proofErr w:type="gramEnd"/>
+      <w:r>
+        <w:t xml:space="preserve">, and </w:t>
+      </w:r>
+      <w:proofErr w:type="spellStart"/>
+      <w:r>
+        <w:t>ad_</w:t>
+      </w:r>
+      <w:proofErr w:type="gramStart"/>
+      <w:r>
+        <w:t>playback.json</w:t>
+      </w:r>
+      <w:proofErr w:type="spellEnd"/>
+      <w:proofErr w:type="gramEnd"/>
+      <w:r>
+        <w:t xml:space="preserve">. Backups </w:t>
+      </w:r>
+      <w:r>
+        <w:lastRenderedPageBreak/>
+        <w:t>must account for both database metadata and the corresponding media files. Playback state is transient operational state, not a substitute for queue history.</w:t>
       </w:r>
     </w:p>
     <w:p>
@@ -7631,7 +8616,15 @@
         <w:jc w:val="both"/>
       </w:pPr>
       <w:r>
-        <w:t>The queue view groups controls by procedure. Empty queues show inactive Call next controls; each active room provides a Complete action for its serving ticket.</w:t>
+        <w:t xml:space="preserve">The queue view groups </w:t>
+      </w:r>
+      <w:proofErr w:type="gramStart"/>
+      <w:r>
+        <w:t>controls</w:t>
+      </w:r>
+      <w:proofErr w:type="gramEnd"/>
+      <w:r>
+        <w:t xml:space="preserve"> by procedure. Empty queues show inactive Call next controls; each active room provides a Complete action for its serving ticket.</w:t>
       </w:r>
     </w:p>
     <w:p>
@@ -7852,7 +8845,21 @@
         <w:rPr>
           <w:sz w:val="20"/>
         </w:rPr>
-        <w:t>Figure 14. X-Ray 1 room-specific Manage queue interface</w:t>
+        <w:t xml:space="preserve">Figure 14. X-Ray 1 </w:t>
+      </w:r>
+      <w:proofErr w:type="gramStart"/>
+      <w:r>
+        <w:rPr>
+          <w:sz w:val="20"/>
+        </w:rPr>
+        <w:t>room-specific</w:t>
+      </w:r>
+      <w:proofErr w:type="gramEnd"/>
+      <w:r>
+        <w:rPr>
+          <w:sz w:val="20"/>
+        </w:rPr>
+        <w:t xml:space="preserve"> Manage queue interface</w:t>
       </w:r>
     </w:p>
     <w:p>
@@ -7861,7 +8868,15 @@
         <w:jc w:val="both"/>
       </w:pPr>
       <w:r>
-        <w:t>When a named room account signs in, the system opens Manage queue and displays only the procedure and serving slot assigned to that username. The room card contains two queue actions: Complete and Call next. Complete is enabled only while that room is serving a ticket, and Call next is enabled only when the room is idle and its procedure has a waiting ticket. The detailed waiting list is hidden for room-specific accounts.</w:t>
+        <w:t xml:space="preserve">When a named room account signs in, the system opens Manage queue and displays only the procedure and serving slot assigned to that username. The room card contains two queue actions: Complete and Call next. Complete is enabled only while that room is serving a </w:t>
+      </w:r>
+      <w:proofErr w:type="gramStart"/>
+      <w:r>
+        <w:t>ticket, and</w:t>
+      </w:r>
+      <w:proofErr w:type="gramEnd"/>
+      <w:r>
+        <w:t xml:space="preserve"> Call next is enabled only when the room is idle and its procedure has a waiting ticket. The detailed waiting list is hidden for room-specific accounts.</w:t>
       </w:r>
     </w:p>
     <w:p>
@@ -7989,7 +9004,21 @@
               <w:rPr>
                 <w:sz w:val="19"/>
               </w:rPr>
-              <w:t>Complete and Call next</w:t>
+              <w:t xml:space="preserve">Complete and </w:t>
+            </w:r>
+            <w:proofErr w:type="gramStart"/>
+            <w:r>
+              <w:rPr>
+                <w:sz w:val="19"/>
+              </w:rPr>
+              <w:t>Call</w:t>
+            </w:r>
+            <w:proofErr w:type="gramEnd"/>
+            <w:r>
+              <w:rPr>
+                <w:sz w:val="19"/>
+              </w:rPr>
+              <w:t xml:space="preserve"> next</w:t>
             </w:r>
           </w:p>
         </w:tc>
@@ -8045,7 +9074,21 @@
               <w:rPr>
                 <w:sz w:val="19"/>
               </w:rPr>
-              <w:t>Complete and Call next</w:t>
+              <w:t xml:space="preserve">Complete and </w:t>
+            </w:r>
+            <w:proofErr w:type="gramStart"/>
+            <w:r>
+              <w:rPr>
+                <w:sz w:val="19"/>
+              </w:rPr>
+              <w:t>Call</w:t>
+            </w:r>
+            <w:proofErr w:type="gramEnd"/>
+            <w:r>
+              <w:rPr>
+                <w:sz w:val="19"/>
+              </w:rPr>
+              <w:t xml:space="preserve"> next</w:t>
             </w:r>
           </w:p>
         </w:tc>
@@ -8101,7 +9144,21 @@
               <w:rPr>
                 <w:sz w:val="19"/>
               </w:rPr>
-              <w:t>Complete and Call next</w:t>
+              <w:t xml:space="preserve">Complete and </w:t>
+            </w:r>
+            <w:proofErr w:type="gramStart"/>
+            <w:r>
+              <w:rPr>
+                <w:sz w:val="19"/>
+              </w:rPr>
+              <w:t>Call</w:t>
+            </w:r>
+            <w:proofErr w:type="gramEnd"/>
+            <w:r>
+              <w:rPr>
+                <w:sz w:val="19"/>
+              </w:rPr>
+              <w:t xml:space="preserve"> next</w:t>
             </w:r>
           </w:p>
         </w:tc>
@@ -8157,7 +9214,21 @@
               <w:rPr>
                 <w:sz w:val="19"/>
               </w:rPr>
-              <w:t>Complete and Call next</w:t>
+              <w:t xml:space="preserve">Complete and </w:t>
+            </w:r>
+            <w:proofErr w:type="gramStart"/>
+            <w:r>
+              <w:rPr>
+                <w:sz w:val="19"/>
+              </w:rPr>
+              <w:t>Call</w:t>
+            </w:r>
+            <w:proofErr w:type="gramEnd"/>
+            <w:r>
+              <w:rPr>
+                <w:sz w:val="19"/>
+              </w:rPr>
+              <w:t xml:space="preserve"> next</w:t>
             </w:r>
           </w:p>
         </w:tc>
@@ -8213,7 +9284,21 @@
               <w:rPr>
                 <w:sz w:val="19"/>
               </w:rPr>
-              <w:t>Complete and Call next</w:t>
+              <w:t xml:space="preserve">Complete and </w:t>
+            </w:r>
+            <w:proofErr w:type="gramStart"/>
+            <w:r>
+              <w:rPr>
+                <w:sz w:val="19"/>
+              </w:rPr>
+              <w:t>Call</w:t>
+            </w:r>
+            <w:proofErr w:type="gramEnd"/>
+            <w:r>
+              <w:rPr>
+                <w:sz w:val="19"/>
+              </w:rPr>
+              <w:t xml:space="preserve"> next</w:t>
             </w:r>
           </w:p>
         </w:tc>
@@ -8231,12 +9316,41 @@
     <w:p>
       <w:pPr>
         <w:jc w:val="both"/>
-      </w:pPr>
-      <w:r>
         <w:rPr>
-          <w:b/>
+          <w:bCs/>
         </w:rPr>
-        <w:t>Implementation boundary. The verified restriction is enforced by the dashboard interface using the exact stored username. The queue API currently authorizes the radiology_staff role but does not independently verify the account-to-room assignment. Server-side room authorization is therefore required before the interface restriction can be treated as a security control.</w:t>
+      </w:pPr>
+      <w:r>
+        <w:rPr>
+          <w:bCs/>
+        </w:rPr>
+        <w:t xml:space="preserve">Implementation boundary. The verified restriction is enforced by the dashboard interface using the exact stored username. The queue API currently authorizes the </w:t>
+      </w:r>
+      <w:r>
+        <w:rPr>
+          <w:bCs/>
+        </w:rPr>
+        <w:t>radiology staff</w:t>
+      </w:r>
+      <w:r>
+        <w:rPr>
+          <w:bCs/>
+        </w:rPr>
+        <w:t xml:space="preserve"> role but does not independently verify the account-to-room assignment. Server-side room authorization is therefore required before the interface restriction can be treated as </w:t>
+      </w:r>
+      <w:proofErr w:type="gramStart"/>
+      <w:r>
+        <w:rPr>
+          <w:bCs/>
+        </w:rPr>
+        <w:t>a security</w:t>
+      </w:r>
+      <w:proofErr w:type="gramEnd"/>
+      <w:r>
+        <w:rPr>
+          <w:bCs/>
+        </w:rPr>
+        <w:t xml:space="preserve"> control.</w:t>
       </w:r>
     </w:p>
     <w:p>
@@ -8352,1608 +9466,12 @@
       <w:pPr>
         <w:pStyle w:val="Heading1"/>
       </w:pPr>
-      <w:bookmarkStart w:id="11" w:name="_Toc240571169"/>
-      <w:r>
-        <w:lastRenderedPageBreak/>
-        <w:t>L. USER ACCEPTANCE TEST</w:t>
-      </w:r>
-      <w:bookmarkEnd w:id="11"/>
-    </w:p>
-    <w:p>
-      <w:pPr>
-        <w:pStyle w:val="Heading2"/>
-      </w:pPr>
-      <w:r>
-        <w:t>Purpose and Test Preparation</w:t>
-      </w:r>
-    </w:p>
-    <w:p>
-      <w:pPr>
-        <w:jc w:val="both"/>
-      </w:pPr>
-      <w:r>
-        <w:t>User acceptance testing verifies that representative reception personnel, radiology staff, and administrators can perform the intended workflow on the hospital equipment. Use a separate test database and clearly marked test tickets. Record the application revision, schema version, browser, printer, monitor, and network environment before execution.</w:t>
-      </w:r>
-    </w:p>
-    <w:p>
-      <w:pPr>
-        <w:jc w:val="both"/>
-      </w:pPr>
-      <w:r>
-        <w:t>The following scenarios are prepared for execution. Their status is Pending until a tester records an observed result and supporting evidence. They must not be interpreted as successful hospital acceptance results.</w:t>
-      </w:r>
-    </w:p>
-    <w:p>
-      <w:pPr>
-        <w:keepNext/>
-        <w:jc w:val="both"/>
-      </w:pPr>
-      <w:r>
-        <w:rPr>
-          <w:b/>
-        </w:rPr>
-        <w:t>Table 13. Authentication and ticket acceptance scenarios</w:t>
-      </w:r>
-    </w:p>
-    <w:tbl>
-      <w:tblPr>
-        <w:tblStyle w:val="TableGrid"/>
-        <w:tblW w:w="0" w:type="auto"/>
-        <w:tblLayout w:type="fixed"/>
-        <w:tblLook w:val="04A0" w:firstRow="1" w:lastRow="0" w:firstColumn="1" w:lastColumn="0" w:noHBand="0" w:noVBand="1"/>
-      </w:tblPr>
-      <w:tblGrid>
-        <w:gridCol w:w="936"/>
-        <w:gridCol w:w="3816"/>
-        <w:gridCol w:w="3528"/>
-      </w:tblGrid>
-      <w:tr>
-        <w:trPr>
-          <w:cantSplit/>
-          <w:tblHeader/>
-        </w:trPr>
-        <w:tc>
-          <w:tcPr>
-            <w:tcW w:w="936" w:type="dxa"/>
-          </w:tcPr>
-          <w:p>
-            <w:pPr>
-              <w:spacing w:before="80" w:after="100" w:line="264" w:lineRule="auto"/>
-            </w:pPr>
-            <w:r>
-              <w:rPr>
-                <w:b/>
-                <w:sz w:val="20"/>
-              </w:rPr>
-              <w:t>ID</w:t>
-            </w:r>
-          </w:p>
-        </w:tc>
-        <w:tc>
-          <w:tcPr>
-            <w:tcW w:w="3816" w:type="dxa"/>
-          </w:tcPr>
-          <w:p>
-            <w:pPr>
-              <w:spacing w:before="80" w:after="100" w:line="264" w:lineRule="auto"/>
-            </w:pPr>
-            <w:r>
-              <w:rPr>
-                <w:b/>
-                <w:sz w:val="20"/>
-              </w:rPr>
-              <w:t>Test procedure</w:t>
-            </w:r>
-          </w:p>
-        </w:tc>
-        <w:tc>
-          <w:tcPr>
-            <w:tcW w:w="3528" w:type="dxa"/>
-          </w:tcPr>
-          <w:p>
-            <w:pPr>
-              <w:spacing w:before="80" w:after="100" w:line="264" w:lineRule="auto"/>
-            </w:pPr>
-            <w:r>
-              <w:rPr>
-                <w:b/>
-                <w:sz w:val="20"/>
-              </w:rPr>
-              <w:t>Expected result</w:t>
-            </w:r>
-          </w:p>
-        </w:tc>
-      </w:tr>
-      <w:tr>
-        <w:trPr>
-          <w:cantSplit/>
-        </w:trPr>
-        <w:tc>
-          <w:tcPr>
-            <w:tcW w:w="936" w:type="dxa"/>
-          </w:tcPr>
-          <w:p>
-            <w:pPr>
-              <w:spacing w:before="80" w:after="100" w:line="264" w:lineRule="auto"/>
-            </w:pPr>
-            <w:r>
-              <w:rPr>
-                <w:sz w:val="20"/>
-              </w:rPr>
-              <w:t>UAT 01</w:t>
-            </w:r>
-          </w:p>
-        </w:tc>
-        <w:tc>
-          <w:tcPr>
-            <w:tcW w:w="3816" w:type="dxa"/>
-          </w:tcPr>
-          <w:p>
-            <w:pPr>
-              <w:spacing w:before="80" w:after="100" w:line="264" w:lineRule="auto"/>
-            </w:pPr>
-            <w:r>
-              <w:rPr>
-                <w:sz w:val="20"/>
-              </w:rPr>
-              <w:t>Sign in with valid and invalid credentials.</w:t>
-            </w:r>
-          </w:p>
-        </w:tc>
-        <w:tc>
-          <w:tcPr>
-            <w:tcW w:w="3528" w:type="dxa"/>
-          </w:tcPr>
-          <w:p>
-            <w:pPr>
-              <w:spacing w:before="80" w:after="100" w:line="264" w:lineRule="auto"/>
-            </w:pPr>
-            <w:r>
-              <w:rPr>
-                <w:sz w:val="20"/>
-              </w:rPr>
-              <w:t>Only valid credentials open the staff dashboard.</w:t>
-            </w:r>
-          </w:p>
-        </w:tc>
-      </w:tr>
-      <w:tr>
-        <w:trPr>
-          <w:cantSplit/>
-        </w:trPr>
-        <w:tc>
-          <w:tcPr>
-            <w:tcW w:w="936" w:type="dxa"/>
-          </w:tcPr>
-          <w:p>
-            <w:pPr>
-              <w:spacing w:before="80" w:after="100" w:line="264" w:lineRule="auto"/>
-            </w:pPr>
-            <w:r>
-              <w:rPr>
-                <w:sz w:val="20"/>
-              </w:rPr>
-              <w:t>UAT 02</w:t>
-            </w:r>
-          </w:p>
-        </w:tc>
-        <w:tc>
-          <w:tcPr>
-            <w:tcW w:w="3816" w:type="dxa"/>
-          </w:tcPr>
-          <w:p>
-            <w:pPr>
-              <w:spacing w:before="80" w:after="100" w:line="264" w:lineRule="auto"/>
-            </w:pPr>
-            <w:r>
-              <w:rPr>
-                <w:sz w:val="20"/>
-              </w:rPr>
-              <w:t>Attempt ticket creation as each role and without a session.</w:t>
-            </w:r>
-          </w:p>
-        </w:tc>
-        <w:tc>
-          <w:tcPr>
-            <w:tcW w:w="3528" w:type="dxa"/>
-          </w:tcPr>
-          <w:p>
-            <w:pPr>
-              <w:spacing w:before="80" w:after="100" w:line="264" w:lineRule="auto"/>
-            </w:pPr>
-            <w:r>
-              <w:rPr>
-                <w:sz w:val="20"/>
-              </w:rPr>
-              <w:t>Only receptionists and administrators can issue tickets.</w:t>
-            </w:r>
-          </w:p>
-        </w:tc>
-      </w:tr>
-      <w:tr>
-        <w:trPr>
-          <w:cantSplit/>
-        </w:trPr>
-        <w:tc>
-          <w:tcPr>
-            <w:tcW w:w="936" w:type="dxa"/>
-          </w:tcPr>
-          <w:p>
-            <w:pPr>
-              <w:spacing w:before="80" w:after="100" w:line="264" w:lineRule="auto"/>
-            </w:pPr>
-            <w:r>
-              <w:rPr>
-                <w:sz w:val="20"/>
-              </w:rPr>
-              <w:t>UAT 03</w:t>
-            </w:r>
-          </w:p>
-        </w:tc>
-        <w:tc>
-          <w:tcPr>
-            <w:tcW w:w="3816" w:type="dxa"/>
-          </w:tcPr>
-          <w:p>
-            <w:pPr>
-              <w:spacing w:before="80" w:after="100" w:line="264" w:lineRule="auto"/>
-            </w:pPr>
-            <w:r>
-              <w:rPr>
-                <w:sz w:val="20"/>
-              </w:rPr>
-              <w:t>Issue one ticket for each procedure and IPD/OPD combination.</w:t>
-            </w:r>
-          </w:p>
-        </w:tc>
-        <w:tc>
-          <w:tcPr>
-            <w:tcW w:w="3528" w:type="dxa"/>
-          </w:tcPr>
-          <w:p>
-            <w:pPr>
-              <w:spacing w:before="80" w:after="100" w:line="264" w:lineRule="auto"/>
-            </w:pPr>
-            <w:r>
-              <w:rPr>
-                <w:sz w:val="20"/>
-              </w:rPr>
-              <w:t>Correct code, classification, waiting state, and event are saved.</w:t>
-            </w:r>
-          </w:p>
-        </w:tc>
-      </w:tr>
-      <w:tr>
-        <w:trPr>
-          <w:cantSplit/>
-        </w:trPr>
-        <w:tc>
-          <w:tcPr>
-            <w:tcW w:w="936" w:type="dxa"/>
-          </w:tcPr>
-          <w:p>
-            <w:pPr>
-              <w:spacing w:before="80" w:after="100" w:line="264" w:lineRule="auto"/>
-            </w:pPr>
-            <w:r>
-              <w:rPr>
-                <w:sz w:val="20"/>
-              </w:rPr>
-              <w:t>UAT 04</w:t>
-            </w:r>
-          </w:p>
-        </w:tc>
-        <w:tc>
-          <w:tcPr>
-            <w:tcW w:w="3816" w:type="dxa"/>
-          </w:tcPr>
-          <w:p>
-            <w:pPr>
-              <w:spacing w:before="80" w:after="100" w:line="264" w:lineRule="auto"/>
-            </w:pPr>
-            <w:r>
-              <w:rPr>
-                <w:sz w:val="20"/>
-              </w:rPr>
-              <w:t>Issue tickets concurrently from two reception workstations.</w:t>
-            </w:r>
-          </w:p>
-        </w:tc>
-        <w:tc>
-          <w:tcPr>
-            <w:tcW w:w="3528" w:type="dxa"/>
-          </w:tcPr>
-          <w:p>
-            <w:pPr>
-              <w:spacing w:before="80" w:after="100" w:line="264" w:lineRule="auto"/>
-            </w:pPr>
-            <w:r>
-              <w:rPr>
-                <w:sz w:val="20"/>
-              </w:rPr>
-              <w:t>No lost issue or duplicated number; failures are clearly reported.</w:t>
-            </w:r>
-          </w:p>
-        </w:tc>
-      </w:tr>
-      <w:tr>
-        <w:trPr>
-          <w:cantSplit/>
-        </w:trPr>
-        <w:tc>
-          <w:tcPr>
-            <w:tcW w:w="936" w:type="dxa"/>
-          </w:tcPr>
-          <w:p>
-            <w:pPr>
-              <w:spacing w:before="80" w:after="100" w:line="264" w:lineRule="auto"/>
-            </w:pPr>
-            <w:r>
-              <w:rPr>
-                <w:sz w:val="20"/>
-              </w:rPr>
-              <w:t>UAT 05</w:t>
-            </w:r>
-          </w:p>
-        </w:tc>
-        <w:tc>
-          <w:tcPr>
-            <w:tcW w:w="3816" w:type="dxa"/>
-          </w:tcPr>
-          <w:p>
-            <w:pPr>
-              <w:spacing w:before="80" w:after="100" w:line="264" w:lineRule="auto"/>
-            </w:pPr>
-            <w:r>
-              <w:rPr>
-                <w:sz w:val="20"/>
-              </w:rPr>
-              <w:t>Repeat the first issue after a date rollover.</w:t>
-            </w:r>
-          </w:p>
-        </w:tc>
-        <w:tc>
-          <w:tcPr>
-            <w:tcW w:w="3528" w:type="dxa"/>
-          </w:tcPr>
-          <w:p>
-            <w:pPr>
-              <w:spacing w:before="80" w:after="100" w:line="264" w:lineRule="auto"/>
-            </w:pPr>
-            <w:r>
-              <w:rPr>
-                <w:sz w:val="20"/>
-              </w:rPr>
-              <w:t>The new daily number is valid and historical tickets remain distinguishable.</w:t>
-            </w:r>
-          </w:p>
-        </w:tc>
-      </w:tr>
-      <w:tr>
-        <w:trPr>
-          <w:cantSplit/>
-        </w:trPr>
-        <w:tc>
-          <w:tcPr>
-            <w:tcW w:w="936" w:type="dxa"/>
-          </w:tcPr>
-          <w:p>
-            <w:pPr>
-              <w:spacing w:before="80" w:after="100" w:line="264" w:lineRule="auto"/>
-            </w:pPr>
-            <w:r>
-              <w:rPr>
-                <w:sz w:val="20"/>
-              </w:rPr>
-              <w:t>UAT 06</w:t>
-            </w:r>
-          </w:p>
-        </w:tc>
-        <w:tc>
-          <w:tcPr>
-            <w:tcW w:w="3816" w:type="dxa"/>
-          </w:tcPr>
-          <w:p>
-            <w:pPr>
-              <w:spacing w:before="80" w:after="100" w:line="264" w:lineRule="auto"/>
-            </w:pPr>
-            <w:r>
-              <w:rPr>
-                <w:sz w:val="20"/>
-              </w:rPr>
-              <w:t>Print the generated ticket.</w:t>
-            </w:r>
-          </w:p>
-        </w:tc>
-        <w:tc>
-          <w:tcPr>
-            <w:tcW w:w="3528" w:type="dxa"/>
-          </w:tcPr>
-          <w:p>
-            <w:pPr>
-              <w:spacing w:before="80" w:after="100" w:line="264" w:lineRule="auto"/>
-            </w:pPr>
-            <w:r>
-              <w:rPr>
-                <w:sz w:val="20"/>
-              </w:rPr>
-              <w:t>Slip remains legible and matches the saved ticket.</w:t>
-            </w:r>
-          </w:p>
-        </w:tc>
-      </w:tr>
-    </w:tbl>
-    <w:p>
-      <w:pPr>
-        <w:spacing w:after="0"/>
-      </w:pPr>
-    </w:p>
-    <w:p>
-      <w:r>
-        <w:br w:type="page"/>
-      </w:r>
-    </w:p>
-    <w:p>
-      <w:pPr>
-        <w:pStyle w:val="Heading2"/>
-      </w:pPr>
-      <w:r>
-        <w:lastRenderedPageBreak/>
-        <w:t>L. USER ACCEPTANCE TEST continued</w:t>
-      </w:r>
-    </w:p>
-    <w:p>
-      <w:pPr>
-        <w:keepNext/>
-        <w:jc w:val="both"/>
-      </w:pPr>
-      <w:r>
-        <w:rPr>
-          <w:b/>
-        </w:rPr>
-        <w:t>Table 14. Queue report and display scenarios</w:t>
-      </w:r>
-    </w:p>
-    <w:tbl>
-      <w:tblPr>
-        <w:tblStyle w:val="TableGrid"/>
-        <w:tblW w:w="0" w:type="auto"/>
-        <w:tblLayout w:type="fixed"/>
-        <w:tblLook w:val="04A0" w:firstRow="1" w:lastRow="0" w:firstColumn="1" w:lastColumn="0" w:noHBand="0" w:noVBand="1"/>
-      </w:tblPr>
-      <w:tblGrid>
-        <w:gridCol w:w="936"/>
-        <w:gridCol w:w="3816"/>
-        <w:gridCol w:w="3528"/>
-      </w:tblGrid>
-      <w:tr>
-        <w:trPr>
-          <w:cantSplit/>
-          <w:tblHeader/>
-        </w:trPr>
-        <w:tc>
-          <w:tcPr>
-            <w:tcW w:w="936" w:type="dxa"/>
-          </w:tcPr>
-          <w:p>
-            <w:pPr>
-              <w:spacing w:before="80" w:after="100" w:line="264" w:lineRule="auto"/>
-            </w:pPr>
-            <w:r>
-              <w:rPr>
-                <w:b/>
-                <w:sz w:val="20"/>
-              </w:rPr>
-              <w:t>ID</w:t>
-            </w:r>
-          </w:p>
-        </w:tc>
-        <w:tc>
-          <w:tcPr>
-            <w:tcW w:w="3816" w:type="dxa"/>
-          </w:tcPr>
-          <w:p>
-            <w:pPr>
-              <w:spacing w:before="80" w:after="100" w:line="264" w:lineRule="auto"/>
-            </w:pPr>
-            <w:r>
-              <w:rPr>
-                <w:b/>
-                <w:sz w:val="20"/>
-              </w:rPr>
-              <w:t>Test procedure</w:t>
-            </w:r>
-          </w:p>
-        </w:tc>
-        <w:tc>
-          <w:tcPr>
-            <w:tcW w:w="3528" w:type="dxa"/>
-          </w:tcPr>
-          <w:p>
-            <w:pPr>
-              <w:spacing w:before="80" w:after="100" w:line="264" w:lineRule="auto"/>
-            </w:pPr>
-            <w:r>
-              <w:rPr>
-                <w:b/>
-                <w:sz w:val="20"/>
-              </w:rPr>
-              <w:t>Expected result</w:t>
-            </w:r>
-          </w:p>
-        </w:tc>
-      </w:tr>
-      <w:tr>
-        <w:trPr>
-          <w:cantSplit/>
-        </w:trPr>
-        <w:tc>
-          <w:tcPr>
-            <w:tcW w:w="936" w:type="dxa"/>
-          </w:tcPr>
-          <w:p>
-            <w:pPr>
-              <w:spacing w:before="80" w:after="100" w:line="264" w:lineRule="auto"/>
-            </w:pPr>
-            <w:r>
-              <w:rPr>
-                <w:sz w:val="20"/>
-              </w:rPr>
-              <w:t>UAT 07</w:t>
-            </w:r>
-          </w:p>
-        </w:tc>
-        <w:tc>
-          <w:tcPr>
-            <w:tcW w:w="3816" w:type="dxa"/>
-          </w:tcPr>
-          <w:p>
-            <w:pPr>
-              <w:spacing w:before="80" w:after="100" w:line="264" w:lineRule="auto"/>
-            </w:pPr>
-            <w:r>
-              <w:rPr>
-                <w:sz w:val="20"/>
-              </w:rPr>
-              <w:t>Queue OPD then IPD tickets for the same procedure.</w:t>
-            </w:r>
-          </w:p>
-        </w:tc>
-        <w:tc>
-          <w:tcPr>
-            <w:tcW w:w="3528" w:type="dxa"/>
-          </w:tcPr>
-          <w:p>
-            <w:pPr>
-              <w:spacing w:before="80" w:after="100" w:line="264" w:lineRule="auto"/>
-            </w:pPr>
-            <w:r>
-              <w:rPr>
-                <w:sz w:val="20"/>
-              </w:rPr>
-              <w:t>IPD is called first; FIFO is preserved within each category.</w:t>
-            </w:r>
-          </w:p>
-        </w:tc>
-      </w:tr>
-      <w:tr>
-        <w:trPr>
-          <w:cantSplit/>
-        </w:trPr>
-        <w:tc>
-          <w:tcPr>
-            <w:tcW w:w="936" w:type="dxa"/>
-          </w:tcPr>
-          <w:p>
-            <w:pPr>
-              <w:spacing w:before="80" w:after="100" w:line="264" w:lineRule="auto"/>
-            </w:pPr>
-            <w:r>
-              <w:rPr>
-                <w:sz w:val="20"/>
-              </w:rPr>
-              <w:t>UAT 08</w:t>
-            </w:r>
-          </w:p>
-        </w:tc>
-        <w:tc>
-          <w:tcPr>
-            <w:tcW w:w="3816" w:type="dxa"/>
-          </w:tcPr>
-          <w:p>
-            <w:pPr>
-              <w:spacing w:before="80" w:after="100" w:line="264" w:lineRule="auto"/>
-            </w:pPr>
-            <w:r>
-              <w:rPr>
-                <w:sz w:val="20"/>
-              </w:rPr>
-              <w:t>Call and complete tickets in all five room slots.</w:t>
-            </w:r>
-          </w:p>
-        </w:tc>
-        <w:tc>
-          <w:tcPr>
-            <w:tcW w:w="3528" w:type="dxa"/>
-          </w:tcPr>
-          <w:p>
-            <w:pPr>
-              <w:spacing w:before="80" w:after="100" w:line="264" w:lineRule="auto"/>
-            </w:pPr>
-            <w:r>
-              <w:rPr>
-                <w:sz w:val="20"/>
-              </w:rPr>
-              <w:t>The correct slot and lifecycle timestamps are persisted.</w:t>
-            </w:r>
-          </w:p>
-        </w:tc>
-      </w:tr>
-      <w:tr>
-        <w:trPr>
-          <w:cantSplit/>
-        </w:trPr>
-        <w:tc>
-          <w:tcPr>
-            <w:tcW w:w="936" w:type="dxa"/>
-          </w:tcPr>
-          <w:p>
-            <w:pPr>
-              <w:spacing w:before="80" w:after="100" w:line="264" w:lineRule="auto"/>
-            </w:pPr>
-            <w:r>
-              <w:rPr>
-                <w:sz w:val="20"/>
-              </w:rPr>
-              <w:t>UAT 09</w:t>
-            </w:r>
-          </w:p>
-        </w:tc>
-        <w:tc>
-          <w:tcPr>
-            <w:tcW w:w="3816" w:type="dxa"/>
-          </w:tcPr>
-          <w:p>
-            <w:pPr>
-              <w:spacing w:before="80" w:after="100" w:line="264" w:lineRule="auto"/>
-            </w:pPr>
-            <w:r>
-              <w:rPr>
-                <w:sz w:val="20"/>
-              </w:rPr>
-              <w:t>Use simultaneous calls and attempt an unauthorized room operation.</w:t>
-            </w:r>
-          </w:p>
-        </w:tc>
-        <w:tc>
-          <w:tcPr>
-            <w:tcW w:w="3528" w:type="dxa"/>
-          </w:tcPr>
-          <w:p>
-            <w:pPr>
-              <w:spacing w:before="80" w:after="100" w:line="264" w:lineRule="auto"/>
-            </w:pPr>
-            <w:r>
-              <w:rPr>
-                <w:sz w:val="20"/>
-              </w:rPr>
-              <w:t>No ticket is assigned twice and room policy is enforced server-side.</w:t>
-            </w:r>
-          </w:p>
-        </w:tc>
-      </w:tr>
-      <w:tr>
-        <w:trPr>
-          <w:cantSplit/>
-        </w:trPr>
-        <w:tc>
-          <w:tcPr>
-            <w:tcW w:w="936" w:type="dxa"/>
-          </w:tcPr>
-          <w:p>
-            <w:pPr>
-              <w:spacing w:before="80" w:after="100" w:line="264" w:lineRule="auto"/>
-            </w:pPr>
-            <w:r>
-              <w:rPr>
-                <w:sz w:val="20"/>
-              </w:rPr>
-              <w:t>UAT 10</w:t>
-            </w:r>
-          </w:p>
-        </w:tc>
-        <w:tc>
-          <w:tcPr>
-            <w:tcW w:w="3816" w:type="dxa"/>
-          </w:tcPr>
-          <w:p>
-            <w:pPr>
-              <w:spacing w:before="80" w:after="100" w:line="264" w:lineRule="auto"/>
-            </w:pPr>
-            <w:r>
-              <w:rPr>
-                <w:sz w:val="20"/>
-              </w:rPr>
-              <w:t>Observe the public display after issue, call, and completion.</w:t>
-            </w:r>
-          </w:p>
-        </w:tc>
-        <w:tc>
-          <w:tcPr>
-            <w:tcW w:w="3528" w:type="dxa"/>
-          </w:tcPr>
-          <w:p>
-            <w:pPr>
-              <w:spacing w:before="80" w:after="100" w:line="264" w:lineRule="auto"/>
-            </w:pPr>
-            <w:r>
-              <w:rPr>
-                <w:sz w:val="20"/>
-              </w:rPr>
-              <w:t>Displayed codes match the server within the agreed latency target.</w:t>
-            </w:r>
-          </w:p>
-        </w:tc>
-      </w:tr>
-      <w:tr>
-        <w:trPr>
-          <w:cantSplit/>
-        </w:trPr>
-        <w:tc>
-          <w:tcPr>
-            <w:tcW w:w="936" w:type="dxa"/>
-          </w:tcPr>
-          <w:p>
-            <w:pPr>
-              <w:spacing w:before="80" w:after="100" w:line="264" w:lineRule="auto"/>
-            </w:pPr>
-            <w:r>
-              <w:rPr>
-                <w:sz w:val="20"/>
-              </w:rPr>
-              <w:t>UAT 11</w:t>
-            </w:r>
-          </w:p>
-        </w:tc>
-        <w:tc>
-          <w:tcPr>
-            <w:tcW w:w="3816" w:type="dxa"/>
-          </w:tcPr>
-          <w:p>
-            <w:pPr>
-              <w:spacing w:before="80" w:after="100" w:line="264" w:lineRule="auto"/>
-            </w:pPr>
-            <w:r>
-              <w:rPr>
-                <w:sz w:val="20"/>
-              </w:rPr>
-              <w:t>Select report dates and procedure; download Excel.</w:t>
-            </w:r>
-          </w:p>
-        </w:tc>
-        <w:tc>
-          <w:tcPr>
-            <w:tcW w:w="3528" w:type="dxa"/>
-          </w:tcPr>
-          <w:p>
-            <w:pPr>
-              <w:spacing w:before="80" w:after="100" w:line="264" w:lineRule="auto"/>
-            </w:pPr>
-            <w:r>
-              <w:rPr>
-                <w:sz w:val="20"/>
-              </w:rPr>
-              <w:t>The screen and workbook reconcile with test records.</w:t>
-            </w:r>
-          </w:p>
-        </w:tc>
-      </w:tr>
-      <w:tr>
-        <w:trPr>
-          <w:cantSplit/>
-        </w:trPr>
-        <w:tc>
-          <w:tcPr>
-            <w:tcW w:w="936" w:type="dxa"/>
-          </w:tcPr>
-          <w:p>
-            <w:pPr>
-              <w:spacing w:before="80" w:after="100" w:line="264" w:lineRule="auto"/>
-            </w:pPr>
-            <w:r>
-              <w:rPr>
-                <w:sz w:val="20"/>
-              </w:rPr>
-              <w:t>UAT 12</w:t>
-            </w:r>
-          </w:p>
-        </w:tc>
-        <w:tc>
-          <w:tcPr>
-            <w:tcW w:w="3816" w:type="dxa"/>
-          </w:tcPr>
-          <w:p>
-            <w:pPr>
-              <w:spacing w:before="80" w:after="100" w:line="264" w:lineRule="auto"/>
-            </w:pPr>
-            <w:r>
-              <w:rPr>
-                <w:sz w:val="20"/>
-              </w:rPr>
-              <w:t>Add image/video content and an online media link.</w:t>
-            </w:r>
-          </w:p>
-        </w:tc>
-        <w:tc>
-          <w:tcPr>
-            <w:tcW w:w="3528" w:type="dxa"/>
-          </w:tcPr>
-          <w:p>
-            <w:pPr>
-              <w:spacing w:before="80" w:after="100" w:line="264" w:lineRule="auto"/>
-            </w:pPr>
-            <w:r>
-              <w:rPr>
-                <w:sz w:val="20"/>
-              </w:rPr>
-              <w:t>Applicable content appears with its settings and deletion removes it from rotation.</w:t>
-            </w:r>
-          </w:p>
-        </w:tc>
-      </w:tr>
-      <w:tr>
-        <w:trPr>
-          <w:cantSplit/>
-        </w:trPr>
-        <w:tc>
-          <w:tcPr>
-            <w:tcW w:w="936" w:type="dxa"/>
-          </w:tcPr>
-          <w:p>
-            <w:pPr>
-              <w:spacing w:before="80" w:after="100" w:line="264" w:lineRule="auto"/>
-            </w:pPr>
-            <w:r>
-              <w:rPr>
-                <w:sz w:val="20"/>
-              </w:rPr>
-              <w:t>UAT 13</w:t>
-            </w:r>
-          </w:p>
-        </w:tc>
-        <w:tc>
-          <w:tcPr>
-            <w:tcW w:w="3816" w:type="dxa"/>
-          </w:tcPr>
-          <w:p>
-            <w:pPr>
-              <w:spacing w:before="80" w:after="100" w:line="264" w:lineRule="auto"/>
-            </w:pPr>
-            <w:r>
-              <w:rPr>
-                <w:sz w:val="20"/>
-              </w:rPr>
-              <w:t>Change dashboard tabs during playback, pause manually, and return.</w:t>
-            </w:r>
-          </w:p>
-        </w:tc>
-        <w:tc>
-          <w:tcPr>
-            <w:tcW w:w="3528" w:type="dxa"/>
-          </w:tcPr>
-          <w:p>
-            <w:pPr>
-              <w:spacing w:before="80" w:after="100" w:line="264" w:lineRule="auto"/>
-            </w:pPr>
-            <w:r>
-              <w:rPr>
-                <w:sz w:val="20"/>
-              </w:rPr>
-              <w:t>Background recovery preserves progress; a manual pause remains paused.</w:t>
-            </w:r>
-          </w:p>
-        </w:tc>
-      </w:tr>
-      <w:tr>
-        <w:trPr>
-          <w:cantSplit/>
-        </w:trPr>
-        <w:tc>
-          <w:tcPr>
-            <w:tcW w:w="936" w:type="dxa"/>
-          </w:tcPr>
-          <w:p>
-            <w:pPr>
-              <w:spacing w:before="80" w:after="100" w:line="264" w:lineRule="auto"/>
-            </w:pPr>
-            <w:r>
-              <w:rPr>
-                <w:sz w:val="20"/>
-              </w:rPr>
-              <w:t>UAT 14</w:t>
-            </w:r>
-          </w:p>
-        </w:tc>
-        <w:tc>
-          <w:tcPr>
-            <w:tcW w:w="3816" w:type="dxa"/>
-          </w:tcPr>
-          <w:p>
-            <w:pPr>
-              <w:spacing w:before="80" w:after="100" w:line="264" w:lineRule="auto"/>
-            </w:pPr>
-            <w:r>
-              <w:rPr>
-                <w:sz w:val="20"/>
-              </w:rPr>
-              <w:t>Interrupt the network and restore it.</w:t>
-            </w:r>
-          </w:p>
-        </w:tc>
-        <w:tc>
-          <w:tcPr>
-            <w:tcW w:w="3528" w:type="dxa"/>
-          </w:tcPr>
-          <w:p>
-            <w:pPr>
-              <w:spacing w:before="80" w:after="100" w:line="264" w:lineRule="auto"/>
-            </w:pPr>
-            <w:r>
-              <w:rPr>
-                <w:sz w:val="20"/>
-              </w:rPr>
-              <w:t>Staff can reconcile state without duplicating actions.</w:t>
-            </w:r>
-          </w:p>
-        </w:tc>
-      </w:tr>
-      <w:tr>
-        <w:trPr>
-          <w:cantSplit/>
-        </w:trPr>
-        <w:tc>
-          <w:tcPr>
-            <w:tcW w:w="936" w:type="dxa"/>
-          </w:tcPr>
-          <w:p>
-            <w:pPr>
-              <w:spacing w:before="80" w:after="100" w:line="264" w:lineRule="auto"/>
-            </w:pPr>
-            <w:r>
-              <w:rPr>
-                <w:sz w:val="20"/>
-              </w:rPr>
-              <w:t>UAT 15</w:t>
-            </w:r>
-          </w:p>
-        </w:tc>
-        <w:tc>
-          <w:tcPr>
-            <w:tcW w:w="3816" w:type="dxa"/>
-          </w:tcPr>
-          <w:p>
-            <w:pPr>
-              <w:spacing w:before="80" w:after="100" w:line="264" w:lineRule="auto"/>
-            </w:pPr>
-            <w:r>
-              <w:rPr>
-                <w:sz w:val="20"/>
-              </w:rPr>
-              <w:t>Restore a backup into a separate environment.</w:t>
-            </w:r>
-          </w:p>
-        </w:tc>
-        <w:tc>
-          <w:tcPr>
-            <w:tcW w:w="3528" w:type="dxa"/>
-          </w:tcPr>
-          <w:p>
-            <w:pPr>
-              <w:spacing w:before="80" w:after="100" w:line="264" w:lineRule="auto"/>
-            </w:pPr>
-            <w:r>
-              <w:rPr>
-                <w:sz w:val="20"/>
-              </w:rPr>
-              <w:t>Ticket history, users, and media references are recovered.</w:t>
-            </w:r>
-          </w:p>
-        </w:tc>
-      </w:tr>
-    </w:tbl>
-    <w:p>
-      <w:pPr>
-        <w:spacing w:after="0"/>
-      </w:pPr>
-    </w:p>
-    <w:p>
-      <w:r>
-        <w:br w:type="page"/>
-      </w:r>
-    </w:p>
-    <w:p>
-      <w:pPr>
-        <w:pStyle w:val="Heading2"/>
-      </w:pPr>
-      <w:r>
-        <w:lastRenderedPageBreak/>
-        <w:t>L. ACCEPTANCE RECORD</w:t>
-      </w:r>
-    </w:p>
-    <w:p>
-      <w:pPr>
-        <w:keepNext/>
-        <w:jc w:val="both"/>
-      </w:pPr>
-      <w:r>
-        <w:rPr>
-          <w:b/>
-        </w:rPr>
-        <w:t>Table 15. Test execution record</w:t>
-      </w:r>
-    </w:p>
-    <w:tbl>
-      <w:tblPr>
-        <w:tblStyle w:val="TableGrid"/>
-        <w:tblW w:w="0" w:type="auto"/>
-        <w:tblLayout w:type="fixed"/>
-        <w:tblLook w:val="04A0" w:firstRow="1" w:lastRow="0" w:firstColumn="1" w:lastColumn="0" w:noHBand="0" w:noVBand="1"/>
-      </w:tblPr>
-      <w:tblGrid>
-        <w:gridCol w:w="2880"/>
-        <w:gridCol w:w="5400"/>
-      </w:tblGrid>
-      <w:tr>
-        <w:trPr>
-          <w:cantSplit/>
-          <w:tblHeader/>
-        </w:trPr>
-        <w:tc>
-          <w:tcPr>
-            <w:tcW w:w="2880" w:type="dxa"/>
-          </w:tcPr>
-          <w:p>
-            <w:pPr>
-              <w:spacing w:before="80" w:after="100" w:line="264" w:lineRule="auto"/>
-            </w:pPr>
-            <w:r>
-              <w:rPr>
-                <w:b/>
-                <w:sz w:val="20"/>
-              </w:rPr>
-              <w:t>Record item</w:t>
-            </w:r>
-          </w:p>
-        </w:tc>
-        <w:tc>
-          <w:tcPr>
-            <w:tcW w:w="5400" w:type="dxa"/>
-          </w:tcPr>
-          <w:p>
-            <w:pPr>
-              <w:spacing w:before="80" w:after="100" w:line="264" w:lineRule="auto"/>
-            </w:pPr>
-            <w:r>
-              <w:rPr>
-                <w:b/>
-                <w:sz w:val="20"/>
-              </w:rPr>
-              <w:t>Value to be completed</w:t>
-            </w:r>
-          </w:p>
-        </w:tc>
-      </w:tr>
-      <w:tr>
-        <w:trPr>
-          <w:cantSplit/>
-        </w:trPr>
-        <w:tc>
-          <w:tcPr>
-            <w:tcW w:w="2880" w:type="dxa"/>
-          </w:tcPr>
-          <w:p>
-            <w:pPr>
-              <w:spacing w:before="80" w:after="100" w:line="264" w:lineRule="auto"/>
-            </w:pPr>
-            <w:r>
-              <w:rPr>
-                <w:sz w:val="20"/>
-              </w:rPr>
-              <w:t>Test case ID</w:t>
-            </w:r>
-          </w:p>
-        </w:tc>
-        <w:tc>
-          <w:tcPr>
-            <w:tcW w:w="5400" w:type="dxa"/>
-          </w:tcPr>
-          <w:p>
-            <w:pPr>
-              <w:spacing w:before="80" w:after="100" w:line="264" w:lineRule="auto"/>
-            </w:pPr>
-            <w:r>
-              <w:rPr>
-                <w:sz w:val="20"/>
-              </w:rPr>
-              <w:t>____________________________</w:t>
-            </w:r>
-          </w:p>
-        </w:tc>
-      </w:tr>
-      <w:tr>
-        <w:trPr>
-          <w:cantSplit/>
-        </w:trPr>
-        <w:tc>
-          <w:tcPr>
-            <w:tcW w:w="2880" w:type="dxa"/>
-          </w:tcPr>
-          <w:p>
-            <w:pPr>
-              <w:spacing w:before="80" w:after="100" w:line="264" w:lineRule="auto"/>
-            </w:pPr>
-            <w:r>
-              <w:rPr>
-                <w:sz w:val="20"/>
-              </w:rPr>
-              <w:t>Tester and role</w:t>
-            </w:r>
-          </w:p>
-        </w:tc>
-        <w:tc>
-          <w:tcPr>
-            <w:tcW w:w="5400" w:type="dxa"/>
-          </w:tcPr>
-          <w:p>
-            <w:pPr>
-              <w:spacing w:before="80" w:after="100" w:line="264" w:lineRule="auto"/>
-            </w:pPr>
-            <w:r>
-              <w:rPr>
-                <w:sz w:val="20"/>
-              </w:rPr>
-              <w:t>____________________________</w:t>
-            </w:r>
-          </w:p>
-        </w:tc>
-      </w:tr>
-      <w:tr>
-        <w:trPr>
-          <w:cantSplit/>
-        </w:trPr>
-        <w:tc>
-          <w:tcPr>
-            <w:tcW w:w="2880" w:type="dxa"/>
-          </w:tcPr>
-          <w:p>
-            <w:pPr>
-              <w:spacing w:before="80" w:after="100" w:line="264" w:lineRule="auto"/>
-            </w:pPr>
-            <w:r>
-              <w:rPr>
-                <w:sz w:val="20"/>
-              </w:rPr>
-              <w:t>Execution date</w:t>
-            </w:r>
-          </w:p>
-        </w:tc>
-        <w:tc>
-          <w:tcPr>
-            <w:tcW w:w="5400" w:type="dxa"/>
-          </w:tcPr>
-          <w:p>
-            <w:pPr>
-              <w:spacing w:before="80" w:after="100" w:line="264" w:lineRule="auto"/>
-            </w:pPr>
-            <w:r>
-              <w:rPr>
-                <w:sz w:val="20"/>
-              </w:rPr>
-              <w:t>____________________________</w:t>
-            </w:r>
-          </w:p>
-        </w:tc>
-      </w:tr>
-      <w:tr>
-        <w:trPr>
-          <w:cantSplit/>
-        </w:trPr>
-        <w:tc>
-          <w:tcPr>
-            <w:tcW w:w="2880" w:type="dxa"/>
-          </w:tcPr>
-          <w:p>
-            <w:pPr>
-              <w:spacing w:before="80" w:after="100" w:line="264" w:lineRule="auto"/>
-            </w:pPr>
-            <w:r>
-              <w:rPr>
-                <w:sz w:val="20"/>
-              </w:rPr>
-              <w:t>Application and schema revision</w:t>
-            </w:r>
-          </w:p>
-        </w:tc>
-        <w:tc>
-          <w:tcPr>
-            <w:tcW w:w="5400" w:type="dxa"/>
-          </w:tcPr>
-          <w:p>
-            <w:pPr>
-              <w:spacing w:before="80" w:after="100" w:line="264" w:lineRule="auto"/>
-            </w:pPr>
-            <w:r>
-              <w:rPr>
-                <w:sz w:val="20"/>
-              </w:rPr>
-              <w:t>____________________________</w:t>
-            </w:r>
-          </w:p>
-        </w:tc>
-      </w:tr>
-      <w:tr>
-        <w:trPr>
-          <w:cantSplit/>
-        </w:trPr>
-        <w:tc>
-          <w:tcPr>
-            <w:tcW w:w="2880" w:type="dxa"/>
-          </w:tcPr>
-          <w:p>
-            <w:pPr>
-              <w:spacing w:before="80" w:after="100" w:line="264" w:lineRule="auto"/>
-            </w:pPr>
-            <w:r>
-              <w:rPr>
-                <w:sz w:val="20"/>
-              </w:rPr>
-              <w:t>Observed result</w:t>
-            </w:r>
-          </w:p>
-        </w:tc>
-        <w:tc>
-          <w:tcPr>
-            <w:tcW w:w="5400" w:type="dxa"/>
-          </w:tcPr>
-          <w:p>
-            <w:pPr>
-              <w:spacing w:before="80" w:after="100" w:line="264" w:lineRule="auto"/>
-            </w:pPr>
-            <w:r>
-              <w:rPr>
-                <w:sz w:val="20"/>
-              </w:rPr>
-              <w:t>________________________________________________________</w:t>
-            </w:r>
-          </w:p>
-        </w:tc>
-      </w:tr>
-      <w:tr>
-        <w:trPr>
-          <w:cantSplit/>
-        </w:trPr>
-        <w:tc>
-          <w:tcPr>
-            <w:tcW w:w="2880" w:type="dxa"/>
-          </w:tcPr>
-          <w:p>
-            <w:pPr>
-              <w:spacing w:before="80" w:after="100" w:line="264" w:lineRule="auto"/>
-            </w:pPr>
-            <w:r>
-              <w:rPr>
-                <w:sz w:val="20"/>
-              </w:rPr>
-              <w:t>Evidence location</w:t>
-            </w:r>
-          </w:p>
-        </w:tc>
-        <w:tc>
-          <w:tcPr>
-            <w:tcW w:w="5400" w:type="dxa"/>
-          </w:tcPr>
-          <w:p>
-            <w:pPr>
-              <w:spacing w:before="80" w:after="100" w:line="264" w:lineRule="auto"/>
-            </w:pPr>
-            <w:r>
-              <w:rPr>
-                <w:sz w:val="20"/>
-              </w:rPr>
-              <w:t>____________________________</w:t>
-            </w:r>
-          </w:p>
-        </w:tc>
-      </w:tr>
-      <w:tr>
-        <w:trPr>
-          <w:cantSplit/>
-        </w:trPr>
-        <w:tc>
-          <w:tcPr>
-            <w:tcW w:w="2880" w:type="dxa"/>
-          </w:tcPr>
-          <w:p>
-            <w:pPr>
-              <w:spacing w:before="80" w:after="100" w:line="264" w:lineRule="auto"/>
-            </w:pPr>
-            <w:r>
-              <w:rPr>
-                <w:sz w:val="20"/>
-              </w:rPr>
-              <w:t>Outcome</w:t>
-            </w:r>
-          </w:p>
-        </w:tc>
-        <w:tc>
-          <w:tcPr>
-            <w:tcW w:w="5400" w:type="dxa"/>
-          </w:tcPr>
-          <w:p>
-            <w:pPr>
-              <w:spacing w:before="80" w:after="100" w:line="264" w:lineRule="auto"/>
-            </w:pPr>
-            <w:r>
-              <w:rPr>
-                <w:sz w:val="20"/>
-              </w:rPr>
-              <w:t>Pass / Fail / Blocked</w:t>
-            </w:r>
-          </w:p>
-        </w:tc>
-      </w:tr>
-      <w:tr>
-        <w:trPr>
-          <w:cantSplit/>
-        </w:trPr>
-        <w:tc>
-          <w:tcPr>
-            <w:tcW w:w="2880" w:type="dxa"/>
-          </w:tcPr>
-          <w:p>
-            <w:pPr>
-              <w:spacing w:before="80" w:after="100" w:line="264" w:lineRule="auto"/>
-            </w:pPr>
-            <w:r>
-              <w:rPr>
-                <w:sz w:val="20"/>
-              </w:rPr>
-              <w:t>Defect and retest reference</w:t>
-            </w:r>
-          </w:p>
-        </w:tc>
-        <w:tc>
-          <w:tcPr>
-            <w:tcW w:w="5400" w:type="dxa"/>
-          </w:tcPr>
-          <w:p>
-            <w:pPr>
-              <w:spacing w:before="80" w:after="100" w:line="264" w:lineRule="auto"/>
-            </w:pPr>
-            <w:r>
-              <w:rPr>
-                <w:sz w:val="20"/>
-              </w:rPr>
-              <w:t>____________________________</w:t>
-            </w:r>
-          </w:p>
-        </w:tc>
-      </w:tr>
-    </w:tbl>
-    <w:p>
-      <w:pPr>
-        <w:spacing w:after="0"/>
-      </w:pPr>
-    </w:p>
-    <w:p>
-      <w:pPr>
-        <w:pStyle w:val="Heading2"/>
-      </w:pPr>
-      <w:r>
-        <w:t>Acceptance Criteria</w:t>
-      </w:r>
-    </w:p>
-    <w:p>
-      <w:pPr>
-        <w:jc w:val="both"/>
-      </w:pPr>
-      <w:r>
-        <w:t>The application is eligible for acceptance when required scenarios pass, known blocking defects are corrected, report totals reconcile, authorization checks succeed, and the hospital representatives approve the operational workflow. A failed test must identify the actual observation, reproduction steps, responsible owner, and retest evidence.</w:t>
-      </w:r>
-    </w:p>
-    <w:p>
-      <w:pPr>
-        <w:pStyle w:val="Heading2"/>
-      </w:pPr>
-      <w:r>
-        <w:t>Acceptance Decision</w:t>
-      </w:r>
-    </w:p>
-    <w:p>
-      <w:pPr>
-        <w:jc w:val="both"/>
-      </w:pPr>
-      <w:r>
-        <w:t>Decision:  Accept / Accept subject to recorded conditions / Reject</w:t>
-      </w:r>
-    </w:p>
-    <w:p>
-      <w:r>
-        <w:t>Conditions and unresolved items: __________________________________________</w:t>
-      </w:r>
-    </w:p>
-    <w:p>
-      <w:r>
-        <w:t>Reception representative: ______________________  Date: ______________</w:t>
-      </w:r>
-    </w:p>
-    <w:p>
-      <w:r>
-        <w:t>Radiology representative: ______________________  Date: ______________</w:t>
-      </w:r>
-    </w:p>
-    <w:p>
-      <w:r>
-        <w:t>Administrator or project owner: _________________  Date: ______________</w:t>
-      </w:r>
-    </w:p>
-    <w:p>
-      <w:r>
-        <w:br w:type="page"/>
-      </w:r>
-    </w:p>
-    <w:p>
-      <w:pPr>
-        <w:pStyle w:val="Heading1"/>
-      </w:pPr>
-      <w:bookmarkStart w:id="12" w:name="_Toc240571170"/>
-      <w:r>
-        <w:lastRenderedPageBreak/>
-        <w:t>M. CERTIFICATION</w:t>
-      </w:r>
-      <w:bookmarkEnd w:id="12"/>
-    </w:p>
-    <w:p>
-      <w:pPr>
-        <w:pStyle w:val="Heading2"/>
-      </w:pPr>
-      <w:r>
-        <w:t>System Review and Acceptance Form</w:t>
-      </w:r>
-    </w:p>
-    <w:p>
-      <w:pPr>
-        <w:jc w:val="both"/>
-      </w:pPr>
-      <w:r>
-        <w:t>Project: TGMCI Radiology Queueing System</w:t>
-      </w:r>
-    </w:p>
-    <w:p>
-      <w:pPr>
-        <w:jc w:val="both"/>
-      </w:pPr>
-      <w:r>
-        <w:t>Organization: Tagum Global Medical Center Inc</w:t>
-      </w:r>
-    </w:p>
-    <w:p>
-      <w:pPr>
-        <w:jc w:val="both"/>
-      </w:pPr>
-      <w:r>
-        <w:t>Department: Radiology</w:t>
-      </w:r>
-    </w:p>
-    <w:p>
-      <w:r>
-        <w:t>Application revision: __________________   Review date: __________________</w:t>
-      </w:r>
-    </w:p>
-    <w:p>
-      <w:pPr>
-        <w:jc w:val="both"/>
-      </w:pPr>
-      <w:r>
-        <w:t>The authorized reviewers shall complete this form after examining the system, test records, user guidance, and deployment requirements. Signing this form records the decision and any conditions stated below.</w:t>
-      </w:r>
-    </w:p>
-    <w:p>
-      <w:r>
-        <w:t>Review decision: _______________________________________________________</w:t>
-      </w:r>
-    </w:p>
-    <w:p>
-      <w:r>
-        <w:t>Approved scope: _______________________________________________________</w:t>
-      </w:r>
-    </w:p>
-    <w:p>
-      <w:r>
-        <w:t>Conditions or exclusions: _________________________________________________</w:t>
-      </w:r>
-    </w:p>
-    <w:p/>
-    <w:p>
-      <w:pPr>
-        <w:jc w:val="both"/>
-      </w:pPr>
-      <w:r>
-        <w:rPr>
-          <w:b/>
-        </w:rPr>
-        <w:t>Authorized hospital representative</w:t>
-      </w:r>
-    </w:p>
-    <w:p>
-      <w:r>
-        <w:t>Name: ______________________________________________________________</w:t>
-      </w:r>
-    </w:p>
-    <w:p>
-      <w:r>
-        <w:t>Signature: ______________________________  Date: _______________________</w:t>
-      </w:r>
-    </w:p>
-    <w:p/>
-    <w:p>
-      <w:pPr>
-        <w:jc w:val="both"/>
-      </w:pPr>
-      <w:r>
-        <w:rPr>
-          <w:b/>
-        </w:rPr>
-        <w:t>Radiology department representative</w:t>
-      </w:r>
-    </w:p>
-    <w:p>
-      <w:r>
-        <w:t>Name: ______________________________________________________________</w:t>
-      </w:r>
-    </w:p>
-    <w:p>
-      <w:r>
-        <w:t>Signature: ______________________________  Date: _______________________</w:t>
-      </w:r>
-    </w:p>
-    <w:p/>
-    <w:p>
-      <w:pPr>
-        <w:jc w:val="both"/>
-      </w:pPr>
-      <w:r>
-        <w:rPr>
-          <w:b/>
-        </w:rPr>
-        <w:t>Project representative</w:t>
-      </w:r>
-    </w:p>
-    <w:p>
-      <w:r>
-        <w:t>Name: ______________________________________________________________</w:t>
-      </w:r>
-    </w:p>
-    <w:p>
-      <w:r>
-        <w:t>Signature: ______________________________  Date: _______________________</w:t>
-      </w:r>
-    </w:p>
-    <w:p>
-      <w:r>
-        <w:br w:type="page"/>
-      </w:r>
-    </w:p>
-    <w:p>
-      <w:pPr>
-        <w:pStyle w:val="Heading1"/>
-      </w:pPr>
-      <w:bookmarkStart w:id="13" w:name="_Toc240571171"/>
+      <w:bookmarkStart w:id="11" w:name="_Toc240571171"/>
       <w:r>
         <w:lastRenderedPageBreak/>
         <w:t>N. REFERENCES</w:t>
       </w:r>
-      <w:bookmarkEnd w:id="13"/>
+      <w:bookmarkEnd w:id="11"/>
     </w:p>
     <w:p>
       <w:pPr>
@@ -9961,7 +9479,15 @@
         <w:ind w:left="432" w:hanging="432"/>
       </w:pPr>
       <w:r>
-        <w:t xml:space="preserve">Little, J. D. C. (1961). A proof for the queuing formula: L = λW. Operations Research, 9(3), 383-387. </w:t>
+        <w:t xml:space="preserve">Little, J. D. C. (1961). A proof for the queuing formula: L = </w:t>
+      </w:r>
+      <w:proofErr w:type="spellStart"/>
+      <w:r>
+        <w:t>λW</w:t>
+      </w:r>
+      <w:proofErr w:type="spellEnd"/>
+      <w:r>
+        <w:t xml:space="preserve">. Operations Research, 9(3), 383-387. </w:t>
       </w:r>
       <w:hyperlink r:id="rId30">
         <w:r>
@@ -10003,7 +9529,15 @@
         <w:ind w:left="432" w:hanging="432"/>
       </w:pPr>
       <w:r>
-        <w:t xml:space="preserve">NHS England. (n.d.-b). Why demand and capacity matters. Retrieved September 17, 2026, from </w:t>
+        <w:t xml:space="preserve">NHS England. (n.d.-b). Why demand and capacity </w:t>
+      </w:r>
+      <w:proofErr w:type="gramStart"/>
+      <w:r>
+        <w:t>matters</w:t>
+      </w:r>
+      <w:proofErr w:type="gramEnd"/>
+      <w:r>
+        <w:t xml:space="preserve">. Retrieved September 17, 2026, from </w:t>
       </w:r>
       <w:hyperlink r:id="rId33">
         <w:r>
@@ -10016,8 +9550,13 @@
         <w:spacing w:after="320"/>
         <w:ind w:left="432" w:hanging="432"/>
       </w:pPr>
-      <w:r>
-        <w:t xml:space="preserve">Vasanawala, S. S., &amp; Desser, T. S. (2005). Accommodation of requests for emergency US and CT: Applications of queueing theory to scheduling of urgent studies. Radiology, 235(1), 244-249. </w:t>
+      <w:proofErr w:type="spellStart"/>
+      <w:r>
+        <w:t>Vasanawala</w:t>
+      </w:r>
+      <w:proofErr w:type="spellEnd"/>
+      <w:r>
+        <w:t xml:space="preserve">, S. S., &amp; Desser, T. S. (2005). Accommodation of requests for emergency US and CT: Applications of queueing theory to scheduling of urgent studies. Radiology, 235(1), 244-249. </w:t>
       </w:r>
       <w:hyperlink r:id="rId34">
         <w:r>
@@ -10034,12 +9573,12 @@
       <w:pPr>
         <w:pStyle w:val="Heading1"/>
       </w:pPr>
-      <w:bookmarkStart w:id="14" w:name="_Toc240571172"/>
+      <w:bookmarkStart w:id="12" w:name="_Toc240571172"/>
       <w:r>
         <w:lastRenderedPageBreak/>
         <w:t>APPENDIX A. RELEASE READINESS CHECKLIST</w:t>
       </w:r>
-      <w:bookmarkEnd w:id="14"/>
+      <w:bookmarkEnd w:id="12"/>
     </w:p>
     <w:p>
       <w:pPr>
@@ -10136,7 +9675,21 @@
               <w:rPr>
                 <w:sz w:val="20"/>
               </w:rPr>
-              <w:t>Versioned migration includes every runtime field, including serving_slot, and resolves daily numbering.</w:t>
+              <w:t xml:space="preserve">Versioned migration includes every runtime field, including </w:t>
+            </w:r>
+            <w:proofErr w:type="spellStart"/>
+            <w:r>
+              <w:rPr>
+                <w:sz w:val="20"/>
+              </w:rPr>
+              <w:t>serving_slot</w:t>
+            </w:r>
+            <w:proofErr w:type="spellEnd"/>
+            <w:r>
+              <w:rPr>
+                <w:sz w:val="20"/>
+              </w:rPr>
+              <w:t>, and resolves daily numbering.</w:t>
             </w:r>
           </w:p>
         </w:tc>
@@ -10173,7 +9726,21 @@
               <w:rPr>
                 <w:sz w:val="20"/>
               </w:rPr>
-              <w:t>Role and room checks pass; ticket events identify the signed-in issuer.</w:t>
+              <w:t xml:space="preserve">Role and room </w:t>
+            </w:r>
+            <w:proofErr w:type="gramStart"/>
+            <w:r>
+              <w:rPr>
+                <w:sz w:val="20"/>
+              </w:rPr>
+              <w:t>checks</w:t>
+            </w:r>
+            <w:proofErr w:type="gramEnd"/>
+            <w:r>
+              <w:rPr>
+                <w:sz w:val="20"/>
+              </w:rPr>
+              <w:t xml:space="preserve"> pass; ticket events identify the signed-in issuer.</w:t>
             </w:r>
           </w:p>
         </w:tc>
@@ -10408,7 +9975,15 @@
     </w:p>
     <w:p>
       <w:r>
-        <w:t>Release date: __________________  Responsible owner: __________________</w:t>
+        <w:t>Release date: _________________</w:t>
+      </w:r>
+      <w:proofErr w:type="gramStart"/>
+      <w:r>
+        <w:t>_  Responsible</w:t>
+      </w:r>
+      <w:proofErr w:type="gramEnd"/>
+      <w:r>
+        <w:t xml:space="preserve"> owner: __________________</w:t>
       </w:r>
     </w:p>
     <w:p>
@@ -10425,12 +10000,12 @@
       <w:pPr>
         <w:pStyle w:val="Heading1"/>
       </w:pPr>
-      <w:bookmarkStart w:id="15" w:name="_Toc240571173"/>
+      <w:bookmarkStart w:id="13" w:name="_Toc240571173"/>
       <w:r>
         <w:lastRenderedPageBreak/>
         <w:t>APPENDIX B. IMPLEMENTATION ISSUES</w:t>
       </w:r>
-      <w:bookmarkEnd w:id="15"/>
+      <w:bookmarkEnd w:id="13"/>
     </w:p>
     <w:p>
       <w:pPr>
@@ -10523,11 +10098,33 @@
             <w:pPr>
               <w:spacing w:before="80" w:after="100" w:line="264" w:lineRule="auto"/>
             </w:pPr>
-            <w:r>
-              <w:rPr>
-                <w:sz w:val="20"/>
-              </w:rPr>
-              <w:t>QueueRepository reads and writes serving_slot, but the checked-in SQL omits it. Add a reviewed migration and verify a clean installation.</w:t>
+            <w:proofErr w:type="spellStart"/>
+            <w:r>
+              <w:rPr>
+                <w:sz w:val="20"/>
+              </w:rPr>
+              <w:t>QueueRepository</w:t>
+            </w:r>
+            <w:proofErr w:type="spellEnd"/>
+            <w:r>
+              <w:rPr>
+                <w:sz w:val="20"/>
+              </w:rPr>
+              <w:t xml:space="preserve"> reads and writes </w:t>
+            </w:r>
+            <w:proofErr w:type="spellStart"/>
+            <w:r>
+              <w:rPr>
+                <w:sz w:val="20"/>
+              </w:rPr>
+              <w:t>serving_slot</w:t>
+            </w:r>
+            <w:proofErr w:type="spellEnd"/>
+            <w:r>
+              <w:rPr>
+                <w:sz w:val="20"/>
+              </w:rPr>
+              <w:t>, but the checked-in SQL omits it. Add a reviewed migration and verify a clean installation.</w:t>
             </w:r>
           </w:p>
         </w:tc>
@@ -10564,7 +10161,21 @@
               <w:rPr>
                 <w:sz w:val="20"/>
               </w:rPr>
-              <w:t>The counter resets per date, while ticket_code is globally unique and contains no date. Align identifier generation, lookup, and uniqueness rules.</w:t>
+              <w:t xml:space="preserve">The counter resets per date, while </w:t>
+            </w:r>
+            <w:proofErr w:type="spellStart"/>
+            <w:r>
+              <w:rPr>
+                <w:sz w:val="20"/>
+              </w:rPr>
+              <w:t>ticket_code</w:t>
+            </w:r>
+            <w:proofErr w:type="spellEnd"/>
+            <w:r>
+              <w:rPr>
+                <w:sz w:val="20"/>
+              </w:rPr>
+              <w:t xml:space="preserve"> is globally unique and contains no date. Align identifier generation, lookup, and uniqueness rules.</w:t>
             </w:r>
           </w:p>
         </w:tc>
@@ -10597,11 +10208,33 @@
             <w:pPr>
               <w:spacing w:before="80" w:after="100" w:line="264" w:lineRule="auto"/>
             </w:pPr>
-            <w:r>
-              <w:rPr>
-                <w:sz w:val="20"/>
-              </w:rPr>
-              <w:t>TicketController omits the session user ID when calling TicketService; the default issuer is 1. Pass and validate the authenticated issuer.</w:t>
+            <w:proofErr w:type="spellStart"/>
+            <w:r>
+              <w:rPr>
+                <w:sz w:val="20"/>
+              </w:rPr>
+              <w:t>TicketController</w:t>
+            </w:r>
+            <w:proofErr w:type="spellEnd"/>
+            <w:r>
+              <w:rPr>
+                <w:sz w:val="20"/>
+              </w:rPr>
+              <w:t xml:space="preserve"> omits the session user ID when calling </w:t>
+            </w:r>
+            <w:proofErr w:type="spellStart"/>
+            <w:r>
+              <w:rPr>
+                <w:sz w:val="20"/>
+              </w:rPr>
+              <w:t>TicketService</w:t>
+            </w:r>
+            <w:proofErr w:type="spellEnd"/>
+            <w:r>
+              <w:rPr>
+                <w:sz w:val="20"/>
+              </w:rPr>
+              <w:t>; the default issuer is 1. Pass and validate the authenticated issuer.</w:t>
             </w:r>
           </w:p>
         </w:tc>
@@ -10634,11 +10267,33 @@
             <w:pPr>
               <w:spacing w:before="80" w:after="100" w:line="264" w:lineRule="auto"/>
             </w:pPr>
-            <w:r>
-              <w:rPr>
-                <w:sz w:val="20"/>
-              </w:rPr>
-              <w:t>QueueController checks radiology_staff but does not enforce the UI room assignment. Enforce assignments on the server.</w:t>
+            <w:proofErr w:type="spellStart"/>
+            <w:r>
+              <w:rPr>
+                <w:sz w:val="20"/>
+              </w:rPr>
+              <w:t>QueueController</w:t>
+            </w:r>
+            <w:proofErr w:type="spellEnd"/>
+            <w:r>
+              <w:rPr>
+                <w:sz w:val="20"/>
+              </w:rPr>
+              <w:t xml:space="preserve"> checks </w:t>
+            </w:r>
+            <w:proofErr w:type="spellStart"/>
+            <w:r>
+              <w:rPr>
+                <w:sz w:val="20"/>
+              </w:rPr>
+              <w:t>radiology_staff</w:t>
+            </w:r>
+            <w:proofErr w:type="spellEnd"/>
+            <w:r>
+              <w:rPr>
+                <w:sz w:val="20"/>
+              </w:rPr>
+              <w:t xml:space="preserve"> but does not enforce the UI room assignment. Enforce assignments on the server.</w:t>
             </w:r>
           </w:p>
         </w:tc>
@@ -10671,11 +10326,19 @@
             <w:pPr>
               <w:spacing w:before="80" w:after="100" w:line="264" w:lineRule="auto"/>
             </w:pPr>
-            <w:r>
-              <w:rPr>
-                <w:sz w:val="20"/>
-              </w:rPr>
-              <w:t>callNext accepts a slot index without an occupied-slot guard. Validate slots and concurrency at the persistence boundary.</w:t>
+            <w:proofErr w:type="spellStart"/>
+            <w:r>
+              <w:rPr>
+                <w:sz w:val="20"/>
+              </w:rPr>
+              <w:t>callNext</w:t>
+            </w:r>
+            <w:proofErr w:type="spellEnd"/>
+            <w:r>
+              <w:rPr>
+                <w:sz w:val="20"/>
+              </w:rPr>
+              <w:t xml:space="preserve"> accepts a slot index without an occupied-slot guard. Validate slots and concurrency at the persistence boundary.</w:t>
             </w:r>
           </w:p>
         </w:tc>
@@ -10712,7 +10375,21 @@
               <w:rPr>
                 <w:sz w:val="20"/>
               </w:rPr>
-              <w:t>The playback endpoint accepts writes without authentication. Define and enforce the intended display-writer authorization model.</w:t>
+              <w:t xml:space="preserve">The playback endpoint accepts </w:t>
+            </w:r>
+            <w:proofErr w:type="gramStart"/>
+            <w:r>
+              <w:rPr>
+                <w:sz w:val="20"/>
+              </w:rPr>
+              <w:t>writes</w:t>
+            </w:r>
+            <w:proofErr w:type="gramEnd"/>
+            <w:r>
+              <w:rPr>
+                <w:sz w:val="20"/>
+              </w:rPr>
+              <w:t xml:space="preserve"> without authentication. Define and enforce the intended display-writer authorization model.</w:t>
             </w:r>
           </w:p>
         </w:tc>
@@ -10814,12 +10491,12 @@
       <w:pPr>
         <w:pStyle w:val="Heading1"/>
       </w:pPr>
-      <w:bookmarkStart w:id="16" w:name="_Toc240571174"/>
+      <w:bookmarkStart w:id="14" w:name="_Toc240571174"/>
       <w:r>
         <w:lastRenderedPageBreak/>
         <w:t>APPENDIX C. SOFTWARE TESTING RESULTS</w:t>
       </w:r>
-      <w:bookmarkEnd w:id="16"/>
+      <w:bookmarkEnd w:id="14"/>
     </w:p>
     <w:p>
       <w:pPr>
@@ -10932,7 +10609,21 @@
               <w:rPr>
                 <w:sz w:val="20"/>
               </w:rPr>
-              <w:t>Five tests passed: uninterrupted tab changes, background pause recovery, manual pause preservation, blocked-playback retry, and replaced/ended video handling.</w:t>
+              <w:t xml:space="preserve">Five tests passed: uninterrupted tab changes, background pause recovery, manual pause preservation, </w:t>
+            </w:r>
+            <w:proofErr w:type="gramStart"/>
+            <w:r>
+              <w:rPr>
+                <w:sz w:val="20"/>
+              </w:rPr>
+              <w:t>blocked-playback</w:t>
+            </w:r>
+            <w:proofErr w:type="gramEnd"/>
+            <w:r>
+              <w:rPr>
+                <w:sz w:val="20"/>
+              </w:rPr>
+              <w:t xml:space="preserve"> retry, and replaced/ended video handling.</w:t>
             </w:r>
           </w:p>
         </w:tc>
@@ -11046,7 +10737,15 @@
         <w:jc w:val="both"/>
       </w:pPr>
       <w:r>
-        <w:t>Database integration: Pending. Cross-workstation queue tests: Pending. Hospital staff UAT: Pending. Backup restore: Pending. Production deployment certification: Pending.</w:t>
+        <w:t xml:space="preserve">Database integration: Pending. Cross-workstation queue tests: Pending. Hospital staff UAT: Pending. </w:t>
+      </w:r>
+      <w:proofErr w:type="gramStart"/>
+      <w:r>
+        <w:t>Backup</w:t>
+      </w:r>
+      <w:proofErr w:type="gramEnd"/>
+      <w:r>
+        <w:t xml:space="preserve"> restore: Pending. Production deployment certification: Pending.</w:t>
       </w:r>
     </w:p>
     <w:p>
@@ -11058,12 +10757,12 @@
       <w:pPr>
         <w:pStyle w:val="Heading1"/>
       </w:pPr>
-      <w:bookmarkStart w:id="17" w:name="_Toc240571175"/>
+      <w:bookmarkStart w:id="15" w:name="_Toc240571175"/>
       <w:r>
         <w:lastRenderedPageBreak/>
         <w:t>APPENDIX D. USER MANUAL</w:t>
       </w:r>
-      <w:bookmarkEnd w:id="17"/>
+      <w:bookmarkEnd w:id="15"/>
     </w:p>
     <w:p>
       <w:pPr>
@@ -11418,7 +11117,15 @@
         <w:pStyle w:val="ListBullet"/>
       </w:pPr>
       <w:r>
-        <w:t>Choose X-Ray, Ultrasound, or CT Scan under Procedure Category.</w:t>
+        <w:t xml:space="preserve">Choose X-Ray, Ultrasound, or </w:t>
+      </w:r>
+      <w:proofErr w:type="gramStart"/>
+      <w:r>
+        <w:t>CT Scan</w:t>
+      </w:r>
+      <w:proofErr w:type="gramEnd"/>
+      <w:r>
+        <w:t xml:space="preserve"> under Procedure Category.</w:t>
       </w:r>
     </w:p>
     <w:p>
@@ -11458,7 +11165,23 @@
         <w:jc w:val="both"/>
       </w:pPr>
       <w:r>
-        <w:t>If a print window does not appear, check the browser popup and printer configuration. A print failure does not necessarily mean ticket creation failed. Confirm the latest saved ticket before generating another number.</w:t>
+        <w:t xml:space="preserve">If a print window does not appear, check the browser popup and printer configuration. </w:t>
+      </w:r>
+      <w:proofErr w:type="gramStart"/>
+      <w:r>
+        <w:t>A print</w:t>
+      </w:r>
+      <w:proofErr w:type="gramEnd"/>
+      <w:r>
+        <w:t xml:space="preserve"> failure does not necessarily mean ticket creation </w:t>
+      </w:r>
+      <w:proofErr w:type="gramStart"/>
+      <w:r>
+        <w:t>failed</w:t>
+      </w:r>
+      <w:proofErr w:type="gramEnd"/>
+      <w:r>
+        <w:t>. Confirm the latest saved ticket before generating another number.</w:t>
       </w:r>
     </w:p>
     <w:p>
@@ -11552,7 +11275,15 @@
         <w:jc w:val="both"/>
       </w:pPr>
       <w:r>
-        <w:t>The current user interface has no supported skip or cancellation action. Use the department's authorized exception procedure and record the issue for the administrator.</w:t>
+        <w:t xml:space="preserve">The current user interface has no supported </w:t>
+      </w:r>
+      <w:proofErr w:type="gramStart"/>
+      <w:r>
+        <w:t>skip</w:t>
+      </w:r>
+      <w:proofErr w:type="gramEnd"/>
+      <w:r>
+        <w:t xml:space="preserve"> or cancellation action. Use the department's authorized exception procedure and record the issue for the administrator.</w:t>
       </w:r>
     </w:p>
     <w:p>
@@ -11582,7 +11313,15 @@
         <w:pStyle w:val="ListBullet"/>
       </w:pPr>
       <w:r>
-        <w:t>Open Dashboard and set the From and To dates, or select a date shortcut.</w:t>
+        <w:t xml:space="preserve">Open Dashboard and set the From and To </w:t>
+      </w:r>
+      <w:proofErr w:type="gramStart"/>
+      <w:r>
+        <w:t>dates, or</w:t>
+      </w:r>
+      <w:proofErr w:type="gramEnd"/>
+      <w:r>
+        <w:t xml:space="preserve"> select a date shortcut.</w:t>
       </w:r>
     </w:p>
     <w:p>
@@ -12036,7 +11775,15 @@
     </w:p>
     <w:p>
       <w:r>
-        <w:t>Support contact: __________________________  Local application URL: __________________________</w:t>
+        <w:t>Support contact: _________________________</w:t>
+      </w:r>
+      <w:proofErr w:type="gramStart"/>
+      <w:r>
+        <w:t>_  Local</w:t>
+      </w:r>
+      <w:proofErr w:type="gramEnd"/>
+      <w:r>
+        <w:t xml:space="preserve"> application URL: __________________________</w:t>
       </w:r>
     </w:p>
     <w:p>
@@ -12048,12 +11795,12 @@
       <w:pPr>
         <w:pStyle w:val="Heading1"/>
       </w:pPr>
-      <w:bookmarkStart w:id="18" w:name="_Toc240571176"/>
+      <w:bookmarkStart w:id="16" w:name="_Toc240571176"/>
       <w:r>
         <w:lastRenderedPageBreak/>
         <w:t>APPENDIX E. DEPLOYMENT AND HANDOFF</w:t>
       </w:r>
-      <w:bookmarkEnd w:id="18"/>
+      <w:bookmarkEnd w:id="16"/>
     </w:p>
     <w:p>
       <w:pPr>
@@ -12076,8 +11823,13 @@
         <w:pStyle w:val="ListBullet"/>
       </w:pPr>
       <w:r>
-        <w:t>Place the project in its approved directory and point the web server document root at public/.</w:t>
-      </w:r>
+        <w:t xml:space="preserve">Place the project in its approved directory and point the web server document root at </w:t>
+      </w:r>
+      <w:proofErr w:type="gramStart"/>
+      <w:r>
+        <w:t>public/.</w:t>
+      </w:r>
+      <w:proofErr w:type="gramEnd"/>
     </w:p>
     <w:p>
       <w:pPr>
@@ -12116,7 +11868,15 @@
         <w:pStyle w:val="ListBullet"/>
       </w:pPr>
       <w:r>
-        <w:t>Complete integration tests, backup restore, staff UAT, and the acceptance forms.</w:t>
+        <w:t xml:space="preserve">Complete integration tests, backup restore, staff UAT, and </w:t>
+      </w:r>
+      <w:proofErr w:type="gramStart"/>
+      <w:r>
+        <w:t>the acceptance</w:t>
+      </w:r>
+      <w:proofErr w:type="gramEnd"/>
+      <w:r>
+        <w:t xml:space="preserve"> forms.</w:t>
       </w:r>
     </w:p>
     <w:p>
@@ -12132,7 +11892,31 @@
         <w:jc w:val="both"/>
       </w:pPr>
       <w:r>
-        <w:t>The application name is TGMCI Radiology Queueing System. The requested folder and repository name is TGMCI-Radiology-Queueing-System. Renaming the project does not rename the configured database: the existing default remains tgc_radiology_queue. Update any virtual-host document-root path or shortcuts after a successful folder rename. A repository owner must complete any GitHub rename that the connected account cannot perform.</w:t>
+        <w:t xml:space="preserve">The </w:t>
+      </w:r>
+      <w:proofErr w:type="gramStart"/>
+      <w:r>
+        <w:t>application name</w:t>
+      </w:r>
+      <w:proofErr w:type="gramEnd"/>
+      <w:r>
+        <w:t xml:space="preserve"> </w:t>
+      </w:r>
+      <w:proofErr w:type="gramStart"/>
+      <w:r>
+        <w:t>is</w:t>
+      </w:r>
+      <w:proofErr w:type="gramEnd"/>
+      <w:r>
+        <w:t xml:space="preserve"> TGMCI Radiology Queueing System. The requested folder and repository name is TGMCI-Radiology-Queueing-System. Renaming the project does not rename the configured database: the existing default remains </w:t>
+      </w:r>
+      <w:proofErr w:type="spellStart"/>
+      <w:r>
+        <w:t>tgc_radiology_queue</w:t>
+      </w:r>
+      <w:proofErr w:type="spellEnd"/>
+      <w:r>
+        <w:t>. Update any virtual-host document-root path or shortcuts after a successful folder rename. A repository owner must complete any GitHub rename that the connected account cannot perform.</w:t>
       </w:r>
     </w:p>
     <w:p>
@@ -12406,12 +12190,12 @@
       <w:pPr>
         <w:pStyle w:val="Heading1"/>
       </w:pPr>
-      <w:bookmarkStart w:id="19" w:name="_Toc240571177"/>
+      <w:bookmarkStart w:id="17" w:name="_Toc240571177"/>
       <w:r>
         <w:lastRenderedPageBreak/>
         <w:t>APPENDIX F. PROJECT RESPONSIBILITIES</w:t>
       </w:r>
-      <w:bookmarkEnd w:id="19"/>
+      <w:bookmarkEnd w:id="17"/>
     </w:p>
     <w:p>
       <w:pPr>

</xml_diff>